<commit_message>
Rewrite Transsion bull and bear case with business growth, AI economics, inventory risks and named anchors
</commit_message>
<xml_diff>
--- a/Transsion_H_IPO_Trader_Brief_2026-10-08.docx
+++ b/Transsion_H_IPO_Trader_Brief_2026-10-08.docx
@@ -7,7 +7,7 @@
         <w:pStyle w:val="Title"/>
       </w:pPr>
       <w:r>
-        <w:t>Transsion | H IPO trader briefing</w:t>
+        <w:t>Transsion H Share IPO Trader Brief</w:t>
       </w:r>
     </w:p>
     <w:p>
@@ -15,18 +15,22 @@
         <w:pStyle w:val="Subtitle"/>
       </w:pPr>
       <w:r>
-        <w:t>8 October 2026   |   A 688036 / H 02636   |   H peers lead; closest A references retained</w:t>
+        <w:t>8 October 2026    A 688036    H 02636</w:t>
       </w:r>
     </w:p>
     <w:p>
       <w:r>
         <w:rPr>
           <w:b/>
+          <w:sz w:val="20"/>
         </w:rPr>
         <w:t>Desk view:</w:t>
       </w:r>
       <w:r>
-        <w:t xml:space="preserve"> attractive recovery valuation at the low to midpoint, conditional on margins holding after inventory replenishment. At HK$37.05, the stock is 12.5× trailing / 11.0× 2026 consensus earnings. The trade turns on replacement costs and cash conversion; the 41% A discount alone is insufficient.</w:t>
+        <w:rPr>
+          <w:sz w:val="20"/>
+        </w:rPr>
+        <w:t xml:space="preserve"> cautiously constructive at the low to midpoint. Underwrite an earnings recovery and non-phone expansion; AI remains potential upside until monetisation is demonstrated. Prebuying protected H1 profit, but the larger June stock position now raises cash and write-down risk. The 41% A discount alone does not make the offer cheap.</w:t>
       </w:r>
     </w:p>
     <w:p>
@@ -34,34 +38,21 @@
         <w:rPr>
           <w:sz w:val="18"/>
         </w:rPr>
-        <w:t>Offer HK$35.30–38.80 | Books 7–12 Oct | Expected pricing 13 Oct / listing 15 Oct | Base 86.65m new H shares; 7.0% of enlarged capital. Final price and book coverage remain unverified. [1]</w:t>
-      </w:r>
-    </w:p>
-    <w:p>
-      <w:r>
-        <w:rPr>
-          <w:b/>
-          <w:sz w:val="18"/>
-        </w:rPr>
-        <w:t>Funding:</w:t>
-      </w:r>
-      <w:r>
-        <w:rPr>
-          <w:sz w:val="18"/>
-        </w:rPr>
-        <w:t xml:space="preserve"> midpoint net proceeds ~HK$3.12bn; 40% AI R&amp;D, 30% marketing, 20% mobile internet/IoT, 10% working capital. Only part is earmarked for working capital; expansion spending has a longer payback than the inventory trade. [1]</w:t>
+        <w:t>Offer HK$35.30–38.80; midpoint HK$37.05. Books 7–12 Oct; expected pricing 13 Oct and listing 15 Oct. Base issue: 86.65m new H shares, 7.0% of enlarged capital. Indicative offer terms. [1]</w:t>
       </w:r>
     </w:p>
     <w:p>
       <w:pPr>
-        <w:pStyle w:val="Caption"/>
-        <w:spacing w:before="180"/>
+        <w:pStyle w:val="Heading1"/>
+        <w:keepNext/>
+        <w:spacing w:before="160" w:after="100"/>
       </w:pPr>
       <w:r>
         <w:rPr>
+          <w:b/>
           <w:sz w:val="23"/>
         </w:rPr>
-        <w:t>Good points | potential</w:t>
+        <w:t>Good points and business potential</w:t>
       </w:r>
     </w:p>
     <w:p>
@@ -76,14 +67,14 @@
           <w:b/>
           <w:sz w:val="20"/>
         </w:rPr>
-        <w:t xml:space="preserve">1. Entry valuation leaves room. </w:t>
+        <w:t xml:space="preserve">Non-phone growth is already material. </w:t>
       </w:r>
       <w:r>
         <w:rPr>
           <w:rFonts w:ascii="Arial" w:hAnsi="Arial"/>
           <w:sz w:val="20"/>
         </w:rPr>
-        <w:t>Midpoint TTM P/E is below Xiaomi 16.2× and Anker 18.5×. Consensus recovery is priced at 11.0×; a move to 12–14× implies HK$40–47 if earnings deliver. [4; peer sources]</w:t>
+        <w:t>H1 other products/services revenue rose 91.3% to RMB5.68bn, or 16% of sales. Calculated A-basis gross margin was 29.1%, versus smartphones at 21.3%. Accessories, appliances and energy products can reuse local brands and channels: a credible route to better mix and less dependence on cheap phones. [3, 6, 14]</w:t>
       </w:r>
     </w:p>
     <w:p>
@@ -98,14 +89,14 @@
           <w:b/>
           <w:sz w:val="20"/>
         </w:rPr>
-        <w:t xml:space="preserve">2. Recovery is visible. </w:t>
+        <w:t xml:space="preserve">The installed franchise can capture upgrades. </w:t>
       </w:r>
       <w:r>
         <w:rPr>
           <w:rFonts w:ascii="Arial" w:hAnsi="Arial"/>
           <w:sz w:val="20"/>
         </w:rPr>
-        <w:t>H1 attributable profit rose 46.2% to RMB1.77bn; A-basis gross margin reached 22.63%. Higher ASPs and mix help, alongside cheaper stock bought earlier. The recovery thesis has reported evidence. [3, 5]</w:t>
+        <w:t>TECNO, Infinix and itel cover different price tiers. Existing distribution, service and local product design give Transsion access to feature-phone replacement and higher-value smartphones. That supports long-term demand; growth outside Africa still requires channel and brand investment. [1, 5]</w:t>
       </w:r>
     </w:p>
     <w:p>
@@ -120,14 +111,14 @@
           <w:b/>
           <w:sz w:val="20"/>
         </w:rPr>
-        <w:t xml:space="preserve">3. Inventory has an operating rationale. </w:t>
+        <w:t xml:space="preserve">AI has a plausible route to value. </w:t>
       </w:r>
       <w:r>
         <w:rPr>
           <w:rFonts w:ascii="Arial" w:hAnsi="Arial"/>
           <w:sz w:val="20"/>
         </w:rPr>
-        <w:t>Raw materials explain 62% of the net stock increase; 92.6% of April-end stock was sold or consumed by August-end. This supports prebuying, while cash recovery still needs proof. [1, 3]</w:t>
+        <w:t>Ella assistance, local-language voice and imaging features are real products. Better local usefulness could improve handset mix and retention; OS traffic can monetise through app distribution and advertising. About 40% of net IPO proceeds supports R&amp;D, including AI. No incremental AI earnings contribution is disclosed. [1, 15–18]</w:t>
       </w:r>
     </w:p>
     <w:p>
@@ -142,26 +133,14 @@
           <w:b/>
           <w:sz w:val="20"/>
         </w:rPr>
-        <w:t xml:space="preserve">4. Cornerstones support the offer. </w:t>
+        <w:t xml:space="preserve">The H price offers a recovery discount. </w:t>
       </w:r>
       <w:r>
         <w:rPr>
           <w:rFonts w:ascii="Arial" w:hAnsi="Arial"/>
           <w:sz w:val="20"/>
         </w:rPr>
-        <w:t>HK$1.25bn commitments cover 38.8% of the base issue at midpoint, leaving about 53.0m non-cornerstone offer shares. Useful supply support; commitments do not establish wider book demand. [1, pp.210–214]</w:t>
-      </w:r>
-    </w:p>
-    <w:p>
-      <w:pPr>
-        <w:pStyle w:val="Caption"/>
-        <w:spacing w:before="180"/>
-      </w:pPr>
-      <w:r>
-        <w:rPr>
-          <w:sz w:val="23"/>
-        </w:rPr>
-        <w:t>Bad points | risks</w:t>
+        <w:t>Midpoint is 12.5× reported TTM earnings versus Xiaomi 16.2× and Anker 18.5×; 11.0× FY26 consensus. H1 owner profit rose 46.2%, with ex-nonrecurring profit up 65.0%. There is an earnings rebound to value, although consensus already assumes further recovery. [3, 4; peer sources]</w:t>
       </w:r>
     </w:p>
     <w:p>
@@ -176,14 +155,28 @@
           <w:b/>
           <w:sz w:val="20"/>
         </w:rPr>
-        <w:t xml:space="preserve">1. Margin could peak before earnings. </w:t>
+        <w:t xml:space="preserve">The anchors include industry and financial capital. </w:t>
       </w:r>
       <w:r>
         <w:rPr>
           <w:rFonts w:ascii="Arial" w:hAnsi="Arial"/>
           <w:sz w:val="20"/>
         </w:rPr>
-        <w:t>Memory rose from 28.0% to 48.4% of cost of inventories sold in FY25 versus Jan–Apr 2026. Replenishing at higher costs can erode the H1 benefit unless ASPs keep up. [1, 5]</w:t>
+        <w:t>Largest is Longsys, US$30m; BYD’s GoldenLink invests RMB150m and MediaTek’s Digimoc US$9m. GIC commits US$17m, E Fund US$16m and Millennium US$15m. Commitments cover 38.8% of the base offer at midpoint. MediaTek is already a shareholder; this is allocation certainty, not a price floor. [1, pp.210–220]</w:t>
+      </w:r>
+    </w:p>
+    <w:p>
+      <w:pPr>
+        <w:pStyle w:val="Heading1"/>
+        <w:keepNext/>
+        <w:spacing w:before="160" w:after="100"/>
+      </w:pPr>
+      <w:r>
+        <w:rPr>
+          <w:b/>
+          <w:sz w:val="23"/>
+        </w:rPr>
+        <w:t>Bad points and risks</w:t>
       </w:r>
     </w:p>
     <w:p>
@@ -198,14 +191,14 @@
           <w:b/>
           <w:sz w:val="20"/>
         </w:rPr>
-        <w:t xml:space="preserve">2. The customer cannot absorb unlimited pricing. </w:t>
+        <w:t xml:space="preserve">Recovery is pricing and cost timing, not a volume rebound. </w:t>
       </w:r>
       <w:r>
         <w:rPr>
           <w:rFonts w:ascii="Arial" w:hAnsi="Arial"/>
           <w:sz w:val="20"/>
         </w:rPr>
-        <w:t>Q2 African smartphone shipments fell 7%; sub-US$100 fell 34% and Transsion fell 14%. Weak entry-level demand limits the ability to pass through component inflation. [8]</w:t>
+        <w:t>H1 smartphones sold fell 11.2% to 39.5m; ASP rose 30.3% to RMB713.4. Management attributes margin improvement to repricing and cheaper historical stock. Replenishment at higher memory costs can squeeze margins unless pricing or mix offsets it. FY26 consensus is still 36% below FY24 owner profit. [1, p.261; 2, 3, 16, 19]</w:t>
       </w:r>
     </w:p>
     <w:p>
@@ -220,14 +213,14 @@
           <w:b/>
           <w:sz w:val="20"/>
         </w:rPr>
-        <w:t xml:space="preserve">3. Profit has yet to turn into cash. </w:t>
+        <w:t xml:space="preserve">Inventory is now the principal cash risk. </w:t>
       </w:r>
       <w:r>
         <w:rPr>
           <w:rFonts w:ascii="Arial" w:hAnsi="Arial"/>
           <w:sz w:val="20"/>
         </w:rPr>
-        <w:t>H1 OCF was −RMB5.86bn and inventory doubled to RMB18.94bn. Finished goods also rose RMB1.69bn. Sold or consumed stock is not equivalent to customer cash collected. [1, 3]</w:t>
+        <w:t>Stock more than doubled to RMB18.94bn; H1 OCF was −RMB5.86bn. Prebuying protects supply during inflation, but weaker demand or falling memory prices can leave expensive stock facing handset price cuts. Raw materials drove 62% of the build; the memory amount is undisclosed. April-stock utilisation of 92.6% does not prove June-stock clearance or cash collection. [1, 3, 14]</w:t>
       </w:r>
     </w:p>
     <w:p>
@@ -242,14 +235,78 @@
           <w:b/>
           <w:sz w:val="20"/>
         </w:rPr>
-        <w:t xml:space="preserve">4. The rerating has limits. </w:t>
+        <w:t xml:space="preserve">Affordability and competition constrain the upgrade thesis. </w:t>
       </w:r>
       <w:r>
         <w:rPr>
           <w:rFonts w:ascii="Arial" w:hAnsi="Arial"/>
           <w:sz w:val="20"/>
         </w:rPr>
-        <w:t>Patent costs remain uncertain after the Ericsson settlement; internet is only 1.44% of FY25 revenue despite 80% gross margin. A platform multiple is premature. [1, 9, 10]</w:t>
+        <w:t>Q2 African smartphone demand fell 7%, with sub-US$100 down 34%; Transsion shipments fell 14% while Samsung grew 15%. Raising prices risks losing the customers who built the franchise. Xiaomi also declined 30% in that quarter; Samsung was the immediate share-gain threat. [8]</w:t>
+      </w:r>
+    </w:p>
+    <w:p>
+      <w:pPr>
+        <w:pStyle w:val="ListBullet"/>
+        <w:spacing w:after="100" w:line="254" w:lineRule="auto"/>
+        <w:ind w:left="230" w:hanging="187"/>
+      </w:pPr>
+      <w:r>
+        <w:rPr>
+          <w:rFonts w:ascii="Arial" w:hAnsi="Arial"/>
+          <w:b/>
+          <w:sz w:val="20"/>
+        </w:rPr>
+        <w:t xml:space="preserve">New businesses need to earn their valuation. </w:t>
+      </w:r>
+      <w:r>
+        <w:rPr>
+          <w:rFonts w:ascii="Arial" w:hAnsi="Arial"/>
+          <w:sz w:val="20"/>
+        </w:rPr>
+        <w:t>Internet was only 1.44% of FY25 sales despite 80% gross margin. Generic AI features are copyable and carry R&amp;D/inference costs. H1 R&amp;D rose 20.2%; FX losses were RMB390m, and patent/royalty risk remains after Ericsson’s settlement. Expansion can consume cash before it raises EPS. [1–3, 9, 10, 17]</w:t>
+      </w:r>
+    </w:p>
+    <w:p>
+      <w:r>
+        <w:rPr>
+          <w:b/>
+          <w:sz w:val="18"/>
+        </w:rPr>
+        <w:t>What changes conviction:</w:t>
+      </w:r>
+      <w:r>
+        <w:rPr>
+          <w:sz w:val="18"/>
+        </w:rPr>
+        <w:t xml:space="preserve"> smartphone margin holding on replacement stock, non-phone gross profit scaling and inventory releasing cash. Weak margins with stock still elevated would undermine the recovery case. Strong AI usage needs to translate into handset profit or service revenue before paying a platform premium.</w:t>
+      </w:r>
+    </w:p>
+    <w:p>
+      <w:r>
+        <w:br w:type="page"/>
+      </w:r>
+    </w:p>
+    <w:p>
+      <w:pPr>
+        <w:pStyle w:val="Heading1"/>
+        <w:keepNext/>
+        <w:spacing w:before="160" w:after="100"/>
+      </w:pPr>
+      <w:r>
+        <w:rPr>
+          <w:b/>
+          <w:sz w:val="23"/>
+        </w:rPr>
+        <w:t>H share valuation and peer relevance</w:t>
+      </w:r>
+    </w:p>
+    <w:p>
+      <w:r>
+        <w:rPr>
+          <w:sz w:val="19"/>
+        </w:rPr>
+        <w:t>Xiaomi is the closest listed handset-brand peer. Anker is an overseas branded-device comparison for the non-phone opportunity. Huaqin and Longcheer are ODM references; their customers and economics differ. No listed company fully matches Transsion’s entry-level emerging-market exposure.</w:t>
       </w:r>
     </w:p>
     <w:p>
@@ -257,7 +314,7 @@
         <w:pStyle w:val="Caption"/>
       </w:pPr>
       <w:r>
-        <w:t>Illustrative price sensitivity | from HK$37.05 midpoint</w:t>
+        <w:t>H peer valuations at 6 October 2026</w:t>
       </w:r>
     </w:p>
     <w:tbl>
@@ -282,11 +339,10 @@
         </w:tblCellMar>
       </w:tblPr>
       <w:tblGrid>
-        <w:gridCol w:w="4032"/>
-        <w:gridCol w:w="1584"/>
-        <w:gridCol w:w="1224"/>
-        <w:gridCol w:w="1584"/>
-        <w:gridCol w:w="1584"/>
+        <w:gridCol w:w="2261"/>
+        <w:gridCol w:w="1109"/>
+        <w:gridCol w:w="1469"/>
+        <w:gridCol w:w="5170"/>
       </w:tblGrid>
       <w:tr>
         <w:trPr>
@@ -295,7 +351,7 @@
         </w:trPr>
         <w:tc>
           <w:tcPr>
-            <w:tcW w:type="dxa" w:w="4032"/>
+            <w:tcW w:type="dxa" w:w="2261"/>
             <w:vAlign w:val="center"/>
             <w:shd w:fill="233B53"/>
           </w:tcPr>
@@ -311,554 +367,13 @@
                 <w:color w:val="FFFFFF"/>
                 <w:sz w:val="19"/>
               </w:rPr>
-              <w:t>Case</w:t>
+              <w:t>Company and H ticker</w:t>
             </w:r>
           </w:p>
         </w:tc>
         <w:tc>
           <w:tcPr>
-            <w:tcW w:type="dxa" w:w="1584"/>
-            <w:vAlign w:val="center"/>
-            <w:shd w:fill="233B53"/>
-          </w:tcPr>
-          <w:p>
-            <w:pPr>
-              <w:spacing w:after="0" w:before="0" w:line="250" w:lineRule="auto"/>
-              <w:jc w:val="center"/>
-            </w:pPr>
-            <w:r>
-              <w:rPr>
-                <w:rFonts w:ascii="Arial" w:hAnsi="Arial"/>
-                <w:b/>
-                <w:color w:val="FFFFFF"/>
-                <w:sz w:val="19"/>
-              </w:rPr>
-              <w:t>Owner profit</w:t>
-              <w:br/>
-              <w:t>RMB bn</w:t>
-            </w:r>
-          </w:p>
-        </w:tc>
-        <w:tc>
-          <w:tcPr>
-            <w:tcW w:type="dxa" w:w="1224"/>
-            <w:vAlign w:val="center"/>
-            <w:shd w:fill="233B53"/>
-          </w:tcPr>
-          <w:p>
-            <w:pPr>
-              <w:spacing w:after="0" w:before="0" w:line="250" w:lineRule="auto"/>
-              <w:jc w:val="center"/>
-            </w:pPr>
-            <w:r>
-              <w:rPr>
-                <w:rFonts w:ascii="Arial" w:hAnsi="Arial"/>
-                <w:b/>
-                <w:color w:val="FFFFFF"/>
-                <w:sz w:val="19"/>
-              </w:rPr>
-              <w:t>Chosen</w:t>
-              <w:br/>
-              <w:t>P/E</w:t>
-            </w:r>
-          </w:p>
-        </w:tc>
-        <w:tc>
-          <w:tcPr>
-            <w:tcW w:type="dxa" w:w="1584"/>
-            <w:vAlign w:val="center"/>
-            <w:shd w:fill="233B53"/>
-          </w:tcPr>
-          <w:p>
-            <w:pPr>
-              <w:spacing w:after="0" w:before="0" w:line="250" w:lineRule="auto"/>
-              <w:jc w:val="center"/>
-            </w:pPr>
-            <w:r>
-              <w:rPr>
-                <w:rFonts w:ascii="Arial" w:hAnsi="Arial"/>
-                <w:b/>
-                <w:color w:val="FFFFFF"/>
-                <w:sz w:val="19"/>
-              </w:rPr>
-              <w:t>Implied</w:t>
-              <w:br/>
-              <w:t>HK$</w:t>
-            </w:r>
-          </w:p>
-        </w:tc>
-        <w:tc>
-          <w:tcPr>
-            <w:tcW w:type="dxa" w:w="1584"/>
-            <w:vAlign w:val="center"/>
-            <w:shd w:fill="233B53"/>
-          </w:tcPr>
-          <w:p>
-            <w:pPr>
-              <w:spacing w:after="0" w:before="0" w:line="250" w:lineRule="auto"/>
-              <w:jc w:val="center"/>
-            </w:pPr>
-            <w:r>
-              <w:rPr>
-                <w:rFonts w:ascii="Arial" w:hAnsi="Arial"/>
-                <w:b/>
-                <w:color w:val="FFFFFF"/>
-                <w:sz w:val="19"/>
-              </w:rPr>
-              <w:t>Move</w:t>
-            </w:r>
-          </w:p>
-        </w:tc>
-      </w:tr>
-      <w:tr>
-        <w:trPr>
-          <w:cantSplit/>
-        </w:trPr>
-        <w:tc>
-          <w:tcPr>
-            <w:tcW w:type="dxa" w:w="4032"/>
-            <w:vAlign w:val="center"/>
-            <w:shd w:fill="FFFFFF"/>
-          </w:tcPr>
-          <w:p>
-            <w:pPr>
-              <w:spacing w:after="0" w:before="0" w:line="250" w:lineRule="auto"/>
-              <w:jc w:val="left"/>
-            </w:pPr>
-            <w:r>
-              <w:rPr>
-                <w:rFonts w:ascii="Arial" w:hAnsi="Arial"/>
-                <w:b w:val="0"/>
-                <w:color w:val="000000"/>
-                <w:sz w:val="19"/>
-              </w:rPr>
-              <w:t>Earnings return to FY25 level</w:t>
-            </w:r>
-          </w:p>
-        </w:tc>
-        <w:tc>
-          <w:tcPr>
-            <w:tcW w:type="dxa" w:w="1584"/>
-            <w:vAlign w:val="center"/>
-            <w:shd w:fill="FFFFFF"/>
-          </w:tcPr>
-          <w:p>
-            <w:pPr>
-              <w:spacing w:after="0" w:before="0" w:line="250" w:lineRule="auto"/>
-              <w:jc w:val="center"/>
-            </w:pPr>
-            <w:r>
-              <w:rPr>
-                <w:rFonts w:ascii="Arial" w:hAnsi="Arial"/>
-                <w:b w:val="0"/>
-                <w:color w:val="000000"/>
-                <w:sz w:val="19"/>
-              </w:rPr>
-              <w:t>2.581</w:t>
-            </w:r>
-          </w:p>
-        </w:tc>
-        <w:tc>
-          <w:tcPr>
-            <w:tcW w:type="dxa" w:w="1224"/>
-            <w:vAlign w:val="center"/>
-            <w:shd w:fill="FFFFFF"/>
-          </w:tcPr>
-          <w:p>
-            <w:pPr>
-              <w:spacing w:after="0" w:before="0" w:line="250" w:lineRule="auto"/>
-              <w:jc w:val="center"/>
-            </w:pPr>
-            <w:r>
-              <w:rPr>
-                <w:rFonts w:ascii="Arial" w:hAnsi="Arial"/>
-                <w:b w:val="0"/>
-                <w:color w:val="000000"/>
-                <w:sz w:val="19"/>
-              </w:rPr>
-              <w:t>10×</w:t>
-            </w:r>
-          </w:p>
-        </w:tc>
-        <w:tc>
-          <w:tcPr>
-            <w:tcW w:type="dxa" w:w="1584"/>
-            <w:vAlign w:val="center"/>
-            <w:shd w:fill="FFFFFF"/>
-          </w:tcPr>
-          <w:p>
-            <w:pPr>
-              <w:spacing w:after="0" w:before="0" w:line="250" w:lineRule="auto"/>
-              <w:jc w:val="center"/>
-            </w:pPr>
-            <w:r>
-              <w:rPr>
-                <w:rFonts w:ascii="Arial" w:hAnsi="Arial"/>
-                <w:b w:val="0"/>
-                <w:color w:val="000000"/>
-                <w:sz w:val="19"/>
-              </w:rPr>
-              <w:t>24.40</w:t>
-            </w:r>
-          </w:p>
-        </w:tc>
-        <w:tc>
-          <w:tcPr>
-            <w:tcW w:type="dxa" w:w="1584"/>
-            <w:vAlign w:val="center"/>
-            <w:shd w:fill="FFFFFF"/>
-          </w:tcPr>
-          <w:p>
-            <w:pPr>
-              <w:spacing w:after="0" w:before="0" w:line="250" w:lineRule="auto"/>
-              <w:jc w:val="center"/>
-            </w:pPr>
-            <w:r>
-              <w:rPr>
-                <w:rFonts w:ascii="Arial" w:hAnsi="Arial"/>
-                <w:b w:val="0"/>
-                <w:color w:val="000000"/>
-                <w:sz w:val="19"/>
-              </w:rPr>
-              <w:t>−34%</w:t>
-            </w:r>
-          </w:p>
-        </w:tc>
-      </w:tr>
-      <w:tr>
-        <w:trPr>
-          <w:cantSplit/>
-        </w:trPr>
-        <w:tc>
-          <w:tcPr>
-            <w:tcW w:type="dxa" w:w="4032"/>
-            <w:vAlign w:val="center"/>
-            <w:shd w:fill="EEF3F7"/>
-          </w:tcPr>
-          <w:p>
-            <w:pPr>
-              <w:spacing w:after="0" w:before="0" w:line="250" w:lineRule="auto"/>
-              <w:jc w:val="left"/>
-            </w:pPr>
-            <w:r>
-              <w:rPr>
-                <w:rFonts w:ascii="Arial" w:hAnsi="Arial"/>
-                <w:b w:val="0"/>
-                <w:color w:val="000000"/>
-                <w:sz w:val="19"/>
-              </w:rPr>
-              <w:t>2026 consensus; modest rerating</w:t>
-            </w:r>
-          </w:p>
-        </w:tc>
-        <w:tc>
-          <w:tcPr>
-            <w:tcW w:type="dxa" w:w="1584"/>
-            <w:vAlign w:val="center"/>
-            <w:shd w:fill="EEF3F7"/>
-          </w:tcPr>
-          <w:p>
-            <w:pPr>
-              <w:spacing w:after="0" w:before="0" w:line="250" w:lineRule="auto"/>
-              <w:jc w:val="center"/>
-            </w:pPr>
-            <w:r>
-              <w:rPr>
-                <w:rFonts w:ascii="Arial" w:hAnsi="Arial"/>
-                <w:b w:val="0"/>
-                <w:color w:val="000000"/>
-                <w:sz w:val="19"/>
-              </w:rPr>
-              <w:t>3.557</w:t>
-            </w:r>
-          </w:p>
-        </w:tc>
-        <w:tc>
-          <w:tcPr>
-            <w:tcW w:type="dxa" w:w="1224"/>
-            <w:vAlign w:val="center"/>
-            <w:shd w:fill="EEF3F7"/>
-          </w:tcPr>
-          <w:p>
-            <w:pPr>
-              <w:spacing w:after="0" w:before="0" w:line="250" w:lineRule="auto"/>
-              <w:jc w:val="center"/>
-            </w:pPr>
-            <w:r>
-              <w:rPr>
-                <w:rFonts w:ascii="Arial" w:hAnsi="Arial"/>
-                <w:b w:val="0"/>
-                <w:color w:val="000000"/>
-                <w:sz w:val="19"/>
-              </w:rPr>
-              <w:t>12×</w:t>
-            </w:r>
-          </w:p>
-        </w:tc>
-        <w:tc>
-          <w:tcPr>
-            <w:tcW w:type="dxa" w:w="1584"/>
-            <w:vAlign w:val="center"/>
-            <w:shd w:fill="EEF3F7"/>
-          </w:tcPr>
-          <w:p>
-            <w:pPr>
-              <w:spacing w:after="0" w:before="0" w:line="250" w:lineRule="auto"/>
-              <w:jc w:val="center"/>
-            </w:pPr>
-            <w:r>
-              <w:rPr>
-                <w:rFonts w:ascii="Arial" w:hAnsi="Arial"/>
-                <w:b w:val="0"/>
-                <w:color w:val="000000"/>
-                <w:sz w:val="19"/>
-              </w:rPr>
-              <w:t>40.36</w:t>
-            </w:r>
-          </w:p>
-        </w:tc>
-        <w:tc>
-          <w:tcPr>
-            <w:tcW w:type="dxa" w:w="1584"/>
-            <w:vAlign w:val="center"/>
-            <w:shd w:fill="EEF3F7"/>
-          </w:tcPr>
-          <w:p>
-            <w:pPr>
-              <w:spacing w:after="0" w:before="0" w:line="250" w:lineRule="auto"/>
-              <w:jc w:val="center"/>
-            </w:pPr>
-            <w:r>
-              <w:rPr>
-                <w:rFonts w:ascii="Arial" w:hAnsi="Arial"/>
-                <w:b w:val="0"/>
-                <w:color w:val="000000"/>
-                <w:sz w:val="19"/>
-              </w:rPr>
-              <w:t>+9%</w:t>
-            </w:r>
-          </w:p>
-        </w:tc>
-      </w:tr>
-      <w:tr>
-        <w:trPr>
-          <w:cantSplit/>
-        </w:trPr>
-        <w:tc>
-          <w:tcPr>
-            <w:tcW w:type="dxa" w:w="4032"/>
-            <w:vAlign w:val="center"/>
-            <w:shd w:fill="FFFFFF"/>
-          </w:tcPr>
-          <w:p>
-            <w:pPr>
-              <w:spacing w:after="0" w:before="0" w:line="250" w:lineRule="auto"/>
-              <w:jc w:val="left"/>
-            </w:pPr>
-            <w:r>
-              <w:rPr>
-                <w:rFonts w:ascii="Arial" w:hAnsi="Arial"/>
-                <w:b w:val="0"/>
-                <w:color w:val="000000"/>
-                <w:sz w:val="19"/>
-              </w:rPr>
-              <w:t>2026 consensus; stronger rerating</w:t>
-            </w:r>
-          </w:p>
-        </w:tc>
-        <w:tc>
-          <w:tcPr>
-            <w:tcW w:type="dxa" w:w="1584"/>
-            <w:vAlign w:val="center"/>
-            <w:shd w:fill="FFFFFF"/>
-          </w:tcPr>
-          <w:p>
-            <w:pPr>
-              <w:spacing w:after="0" w:before="0" w:line="250" w:lineRule="auto"/>
-              <w:jc w:val="center"/>
-            </w:pPr>
-            <w:r>
-              <w:rPr>
-                <w:rFonts w:ascii="Arial" w:hAnsi="Arial"/>
-                <w:b w:val="0"/>
-                <w:color w:val="000000"/>
-                <w:sz w:val="19"/>
-              </w:rPr>
-              <w:t>3.557</w:t>
-            </w:r>
-          </w:p>
-        </w:tc>
-        <w:tc>
-          <w:tcPr>
-            <w:tcW w:type="dxa" w:w="1224"/>
-            <w:vAlign w:val="center"/>
-            <w:shd w:fill="FFFFFF"/>
-          </w:tcPr>
-          <w:p>
-            <w:pPr>
-              <w:spacing w:after="0" w:before="0" w:line="250" w:lineRule="auto"/>
-              <w:jc w:val="center"/>
-            </w:pPr>
-            <w:r>
-              <w:rPr>
-                <w:rFonts w:ascii="Arial" w:hAnsi="Arial"/>
-                <w:b w:val="0"/>
-                <w:color w:val="000000"/>
-                <w:sz w:val="19"/>
-              </w:rPr>
-              <w:t>14×</w:t>
-            </w:r>
-          </w:p>
-        </w:tc>
-        <w:tc>
-          <w:tcPr>
-            <w:tcW w:type="dxa" w:w="1584"/>
-            <w:vAlign w:val="center"/>
-            <w:shd w:fill="FFFFFF"/>
-          </w:tcPr>
-          <w:p>
-            <w:pPr>
-              <w:spacing w:after="0" w:before="0" w:line="250" w:lineRule="auto"/>
-              <w:jc w:val="center"/>
-            </w:pPr>
-            <w:r>
-              <w:rPr>
-                <w:rFonts w:ascii="Arial" w:hAnsi="Arial"/>
-                <w:b w:val="0"/>
-                <w:color w:val="000000"/>
-                <w:sz w:val="19"/>
-              </w:rPr>
-              <w:t>47.09</w:t>
-            </w:r>
-          </w:p>
-        </w:tc>
-        <w:tc>
-          <w:tcPr>
-            <w:tcW w:type="dxa" w:w="1584"/>
-            <w:vAlign w:val="center"/>
-            <w:shd w:fill="FFFFFF"/>
-          </w:tcPr>
-          <w:p>
-            <w:pPr>
-              <w:spacing w:after="0" w:before="0" w:line="250" w:lineRule="auto"/>
-              <w:jc w:val="center"/>
-            </w:pPr>
-            <w:r>
-              <w:rPr>
-                <w:rFonts w:ascii="Arial" w:hAnsi="Arial"/>
-                <w:b w:val="0"/>
-                <w:color w:val="000000"/>
-                <w:sz w:val="19"/>
-              </w:rPr>
-              <w:t>+27%</w:t>
-            </w:r>
-          </w:p>
-        </w:tc>
-      </w:tr>
-    </w:tbl>
-    <w:p>
-      <w:pPr>
-        <w:spacing w:after="0"/>
-      </w:pPr>
-    </w:p>
-    <w:p>
-      <w:r>
-        <w:rPr>
-          <w:sz w:val="17"/>
-        </w:rPr>
-        <w:t>Sensitivity, not targets or probabilities: chosen multiples × owner profit ÷ 1.2378bn shares × HK$1.1705/RMB. Excludes dividends and greenshoe. Before sizing: final price/book demand, A-price response, replacement-stock margins and cash release.</w:t>
-      </w:r>
-    </w:p>
-    <w:p>
-      <w:r>
-        <w:br w:type="page"/>
-      </w:r>
-    </w:p>
-    <w:p>
-      <w:pPr>
-        <w:pStyle w:val="Caption"/>
-        <w:spacing w:before="180"/>
-      </w:pPr>
-      <w:r>
-        <w:rPr>
-          <w:sz w:val="23"/>
-        </w:rPr>
-        <w:t>H-share valuation | weight the business match</w:t>
-      </w:r>
-    </w:p>
-    <w:p>
-      <w:r>
-        <w:rPr>
-          <w:sz w:val="19"/>
-        </w:rPr>
-        <w:t>Xiaomi is the closest listed handset-brand comparator. Anker is a useful overseas consumer-brand reference; Huaqin and Longcheer are manufacturing references. No listed peer replicates Transsion’s entry-level emerging-market mix.</w:t>
-      </w:r>
-    </w:p>
-    <w:p>
-      <w:pPr>
-        <w:pStyle w:val="Caption"/>
-      </w:pPr>
-      <w:r>
-        <w:t>Main peer table | H closes 6 October 2026; approximate reported TTM P/E</w:t>
-      </w:r>
-    </w:p>
-    <w:tbl>
-      <w:tblPr>
-        <w:tblW w:type="auto" w:w="0"/>
-        <w:jc w:val="center"/>
-        <w:tblLayout w:type="fixed"/>
-        <w:tblLook w:firstColumn="1" w:firstRow="1" w:lastColumn="0" w:lastRow="0" w:noHBand="0" w:noVBand="1" w:val="04A0"/>
-        <w:tblBorders>
-          <w:top w:val="single" w:sz="5" w:color="D9D9D9"/>
-          <w:left w:val="single" w:sz="5" w:color="D9D9D9"/>
-          <w:bottom w:val="single" w:sz="5" w:color="D9D9D9"/>
-          <w:right w:val="single" w:sz="5" w:color="D9D9D9"/>
-          <w:insideH w:val="single" w:sz="5" w:color="D9D9D9"/>
-          <w:insideV w:val="single" w:sz="5" w:color="D9D9D9"/>
-        </w:tblBorders>
-        <w:tblCellMar>
-          <w:top w:w="88" w:type="dxa"/>
-          <w:bottom w:w="88" w:type="dxa"/>
-          <w:left w:w="110" w:type="dxa"/>
-          <w:right w:w="110" w:type="dxa"/>
-        </w:tblCellMar>
-      </w:tblPr>
-      <w:tblGrid>
-        <w:gridCol w:w="2246"/>
-        <w:gridCol w:w="1152"/>
-        <w:gridCol w:w="1368"/>
-        <w:gridCol w:w="5242"/>
-      </w:tblGrid>
-      <w:tr>
-        <w:trPr>
-          <w:tblHeader/>
-          <w:cantSplit/>
-        </w:trPr>
-        <w:tc>
-          <w:tcPr>
-            <w:tcW w:type="dxa" w:w="2246"/>
-            <w:vAlign w:val="center"/>
-            <w:shd w:fill="233B53"/>
-          </w:tcPr>
-          <w:p>
-            <w:pPr>
-              <w:spacing w:after="0" w:before="0" w:line="250" w:lineRule="auto"/>
-              <w:jc w:val="left"/>
-            </w:pPr>
-            <w:r>
-              <w:rPr>
-                <w:rFonts w:ascii="Arial" w:hAnsi="Arial"/>
-                <w:b/>
-                <w:color w:val="FFFFFF"/>
-                <w:sz w:val="19"/>
-              </w:rPr>
-              <w:t>Company / H ticker</w:t>
-            </w:r>
-          </w:p>
-        </w:tc>
-        <w:tc>
-          <w:tcPr>
-            <w:tcW w:type="dxa" w:w="1152"/>
+            <w:tcW w:type="dxa" w:w="1109"/>
             <w:vAlign w:val="center"/>
             <w:shd w:fill="233B53"/>
           </w:tcPr>
@@ -882,7 +397,7 @@
         </w:tc>
         <w:tc>
           <w:tcPr>
-            <w:tcW w:type="dxa" w:w="1368"/>
+            <w:tcW w:type="dxa" w:w="1469"/>
             <w:vAlign w:val="center"/>
             <w:shd w:fill="233B53"/>
           </w:tcPr>
@@ -898,15 +413,15 @@
                 <w:color w:val="FFFFFF"/>
                 <w:sz w:val="19"/>
               </w:rPr>
-              <w:t>TTM</w:t>
+              <w:t>Reported</w:t>
               <w:br/>
-              <w:t>P/E</w:t>
+              <w:t>TTM P/E</w:t>
             </w:r>
           </w:p>
         </w:tc>
         <w:tc>
           <w:tcPr>
-            <w:tcW w:type="dxa" w:w="5242"/>
+            <w:tcW w:type="dxa" w:w="5170"/>
             <w:vAlign w:val="center"/>
             <w:shd w:fill="233B53"/>
           </w:tcPr>
@@ -922,7 +437,7 @@
                 <w:color w:val="FFFFFF"/>
                 <w:sz w:val="19"/>
               </w:rPr>
-              <w:t>Relevance / limitation</w:t>
+              <w:t>Business relevance and limitation</w:t>
             </w:r>
           </w:p>
         </w:tc>
@@ -933,7 +448,7 @@
         </w:trPr>
         <w:tc>
           <w:tcPr>
-            <w:tcW w:type="dxa" w:w="2246"/>
+            <w:tcW w:type="dxa" w:w="2261"/>
             <w:vAlign w:val="center"/>
             <w:shd w:fill="FFFFFF"/>
           </w:tcPr>
@@ -949,13 +464,13 @@
                 <w:color w:val="000000"/>
                 <w:sz w:val="19"/>
               </w:rPr>
-              <w:t>Xiaomi / 1810</w:t>
+              <w:t>Xiaomi 1810</w:t>
             </w:r>
           </w:p>
         </w:tc>
         <w:tc>
           <w:tcPr>
-            <w:tcW w:type="dxa" w:w="1152"/>
+            <w:tcW w:type="dxa" w:w="1109"/>
             <w:vAlign w:val="center"/>
             <w:shd w:fill="FFFFFF"/>
           </w:tcPr>
@@ -977,7 +492,7 @@
         </w:tc>
         <w:tc>
           <w:tcPr>
-            <w:tcW w:type="dxa" w:w="1368"/>
+            <w:tcW w:type="dxa" w:w="1469"/>
             <w:vAlign w:val="center"/>
             <w:shd w:fill="FFFFFF"/>
           </w:tcPr>
@@ -999,7 +514,7 @@
         </w:tc>
         <w:tc>
           <w:tcPr>
-            <w:tcW w:type="dxa" w:w="5242"/>
+            <w:tcW w:type="dxa" w:w="5170"/>
             <w:vAlign w:val="center"/>
             <w:shd w:fill="FFFFFF"/>
           </w:tcPr>
@@ -1026,7 +541,7 @@
         </w:trPr>
         <w:tc>
           <w:tcPr>
-            <w:tcW w:type="dxa" w:w="2246"/>
+            <w:tcW w:type="dxa" w:w="2261"/>
             <w:vAlign w:val="center"/>
             <w:shd w:fill="EEF3F7"/>
           </w:tcPr>
@@ -1042,13 +557,13 @@
                 <w:color w:val="000000"/>
                 <w:sz w:val="19"/>
               </w:rPr>
-              <w:t>Anker / 0668</w:t>
+              <w:t>Anker 0668</w:t>
             </w:r>
           </w:p>
         </w:tc>
         <w:tc>
           <w:tcPr>
-            <w:tcW w:type="dxa" w:w="1152"/>
+            <w:tcW w:type="dxa" w:w="1109"/>
             <w:vAlign w:val="center"/>
             <w:shd w:fill="EEF3F7"/>
           </w:tcPr>
@@ -1070,7 +585,7 @@
         </w:tc>
         <w:tc>
           <w:tcPr>
-            <w:tcW w:type="dxa" w:w="1368"/>
+            <w:tcW w:type="dxa" w:w="1469"/>
             <w:vAlign w:val="center"/>
             <w:shd w:fill="EEF3F7"/>
           </w:tcPr>
@@ -1092,7 +607,7 @@
         </w:tc>
         <w:tc>
           <w:tcPr>
-            <w:tcW w:type="dxa" w:w="5242"/>
+            <w:tcW w:type="dxa" w:w="5170"/>
             <w:vAlign w:val="center"/>
             <w:shd w:fill="EEF3F7"/>
           </w:tcPr>
@@ -1108,7 +623,7 @@
                 <w:color w:val="000000"/>
                 <w:sz w:val="19"/>
               </w:rPr>
-              <w:t>Overseas branded hardware; chargers, storage and devices, rather than phones</w:t>
+              <w:t>Overseas branded devices; charging and energy storage overlap, not handsets</w:t>
             </w:r>
           </w:p>
         </w:tc>
@@ -1119,7 +634,7 @@
         </w:trPr>
         <w:tc>
           <w:tcPr>
-            <w:tcW w:type="dxa" w:w="2246"/>
+            <w:tcW w:type="dxa" w:w="2261"/>
             <w:vAlign w:val="center"/>
             <w:shd w:fill="FFFFFF"/>
           </w:tcPr>
@@ -1135,13 +650,13 @@
                 <w:color w:val="000000"/>
                 <w:sz w:val="19"/>
               </w:rPr>
-              <w:t>Huaqin / 3296</w:t>
+              <w:t>Huaqin 3296</w:t>
             </w:r>
           </w:p>
         </w:tc>
         <w:tc>
           <w:tcPr>
-            <w:tcW w:type="dxa" w:w="1152"/>
+            <w:tcW w:type="dxa" w:w="1109"/>
             <w:vAlign w:val="center"/>
             <w:shd w:fill="FFFFFF"/>
           </w:tcPr>
@@ -1163,7 +678,7 @@
         </w:tc>
         <w:tc>
           <w:tcPr>
-            <w:tcW w:type="dxa" w:w="1368"/>
+            <w:tcW w:type="dxa" w:w="1469"/>
             <w:vAlign w:val="center"/>
             <w:shd w:fill="FFFFFF"/>
           </w:tcPr>
@@ -1185,7 +700,7 @@
         </w:tc>
         <w:tc>
           <w:tcPr>
-            <w:tcW w:type="dxa" w:w="5242"/>
+            <w:tcW w:type="dxa" w:w="5170"/>
             <w:vAlign w:val="center"/>
             <w:shd w:fill="FFFFFF"/>
           </w:tcPr>
@@ -1201,7 +716,7 @@
                 <w:color w:val="000000"/>
                 <w:sz w:val="19"/>
               </w:rPr>
-              <w:t>Handset/electronics ODM; different margins and customer exposure</w:t>
+              <w:t>Handset/electronics ODM; manufacturing economics</w:t>
             </w:r>
           </w:p>
         </w:tc>
@@ -1212,7 +727,7 @@
         </w:trPr>
         <w:tc>
           <w:tcPr>
-            <w:tcW w:type="dxa" w:w="2246"/>
+            <w:tcW w:type="dxa" w:w="2261"/>
             <w:vAlign w:val="center"/>
             <w:shd w:fill="EEF3F7"/>
           </w:tcPr>
@@ -1228,13 +743,13 @@
                 <w:color w:val="000000"/>
                 <w:sz w:val="19"/>
               </w:rPr>
-              <w:t>Longcheer / 9611</w:t>
+              <w:t>Longcheer 9611</w:t>
             </w:r>
           </w:p>
         </w:tc>
         <w:tc>
           <w:tcPr>
-            <w:tcW w:type="dxa" w:w="1152"/>
+            <w:tcW w:type="dxa" w:w="1109"/>
             <w:vAlign w:val="center"/>
             <w:shd w:fill="EEF3F7"/>
           </w:tcPr>
@@ -1256,7 +771,7 @@
         </w:tc>
         <w:tc>
           <w:tcPr>
-            <w:tcW w:type="dxa" w:w="1368"/>
+            <w:tcW w:type="dxa" w:w="1469"/>
             <w:vAlign w:val="center"/>
             <w:shd w:fill="EEF3F7"/>
           </w:tcPr>
@@ -1278,7 +793,7 @@
         </w:tc>
         <w:tc>
           <w:tcPr>
-            <w:tcW w:type="dxa" w:w="5242"/>
+            <w:tcW w:type="dxa" w:w="5170"/>
             <w:vAlign w:val="center"/>
             <w:shd w:fill="EEF3F7"/>
           </w:tcPr>
@@ -1294,7 +809,7 @@
                 <w:color w:val="000000"/>
                 <w:sz w:val="19"/>
               </w:rPr>
-              <w:t>Smartphone ODM; manufacturing rather than brand economics</w:t>
+              <w:t>Smartphone ODM; manufacturing economics</w:t>
             </w:r>
           </w:p>
         </w:tc>
@@ -1305,7 +820,7 @@
         </w:trPr>
         <w:tc>
           <w:tcPr>
-            <w:tcW w:type="dxa" w:w="2246"/>
+            <w:tcW w:type="dxa" w:w="2261"/>
             <w:vAlign w:val="center"/>
             <w:shd w:fill="FFFFFF"/>
           </w:tcPr>
@@ -1321,13 +836,13 @@
                 <w:color w:val="000000"/>
                 <w:sz w:val="19"/>
               </w:rPr>
-              <w:t>BYD Electronic / 0285</w:t>
+              <w:t>BYD Electronic 0285</w:t>
             </w:r>
           </w:p>
         </w:tc>
         <w:tc>
           <w:tcPr>
-            <w:tcW w:type="dxa" w:w="1152"/>
+            <w:tcW w:type="dxa" w:w="1109"/>
             <w:vAlign w:val="center"/>
             <w:shd w:fill="FFFFFF"/>
           </w:tcPr>
@@ -1349,7 +864,7 @@
         </w:tc>
         <w:tc>
           <w:tcPr>
-            <w:tcW w:type="dxa" w:w="1368"/>
+            <w:tcW w:type="dxa" w:w="1469"/>
             <w:vAlign w:val="center"/>
             <w:shd w:fill="FFFFFF"/>
           </w:tcPr>
@@ -1371,7 +886,7 @@
         </w:tc>
         <w:tc>
           <w:tcPr>
-            <w:tcW w:type="dxa" w:w="5242"/>
+            <w:tcW w:type="dxa" w:w="5170"/>
             <w:vAlign w:val="center"/>
             <w:shd w:fill="FFFFFF"/>
           </w:tcPr>
@@ -1398,7 +913,7 @@
         </w:trPr>
         <w:tc>
           <w:tcPr>
-            <w:tcW w:type="dxa" w:w="2246"/>
+            <w:tcW w:type="dxa" w:w="2261"/>
             <w:vAlign w:val="center"/>
             <w:shd w:fill="EEF3F7"/>
           </w:tcPr>
@@ -1414,13 +929,13 @@
                 <w:color w:val="000000"/>
                 <w:sz w:val="19"/>
               </w:rPr>
-              <w:t>ZTE / 0763</w:t>
+              <w:t>ZTE 0763</w:t>
             </w:r>
           </w:p>
         </w:tc>
         <w:tc>
           <w:tcPr>
-            <w:tcW w:type="dxa" w:w="1152"/>
+            <w:tcW w:type="dxa" w:w="1109"/>
             <w:vAlign w:val="center"/>
             <w:shd w:fill="EEF3F7"/>
           </w:tcPr>
@@ -1442,7 +957,7 @@
         </w:tc>
         <w:tc>
           <w:tcPr>
-            <w:tcW w:type="dxa" w:w="1368"/>
+            <w:tcW w:type="dxa" w:w="1469"/>
             <w:vAlign w:val="center"/>
             <w:shd w:fill="EEF3F7"/>
           </w:tcPr>
@@ -1464,7 +979,7 @@
         </w:tc>
         <w:tc>
           <w:tcPr>
-            <w:tcW w:type="dxa" w:w="5242"/>
+            <w:tcW w:type="dxa" w:w="5170"/>
             <w:vAlign w:val="center"/>
             <w:shd w:fill="EEF3F7"/>
           </w:tcPr>
@@ -1491,7 +1006,7 @@
         </w:trPr>
         <w:tc>
           <w:tcPr>
-            <w:tcW w:type="dxa" w:w="2246"/>
+            <w:tcW w:type="dxa" w:w="2261"/>
             <w:vAlign w:val="center"/>
             <w:shd w:fill="FFFFFF"/>
           </w:tcPr>
@@ -1507,13 +1022,13 @@
                 <w:color w:val="000000"/>
                 <w:sz w:val="19"/>
               </w:rPr>
-              <w:t>Lenovo / 0992</w:t>
+              <w:t>Lenovo 0992</w:t>
             </w:r>
           </w:p>
         </w:tc>
         <w:tc>
           <w:tcPr>
-            <w:tcW w:type="dxa" w:w="1152"/>
+            <w:tcW w:type="dxa" w:w="1109"/>
             <w:vAlign w:val="center"/>
             <w:shd w:fill="FFFFFF"/>
           </w:tcPr>
@@ -1535,7 +1050,7 @@
         </w:tc>
         <w:tc>
           <w:tcPr>
-            <w:tcW w:type="dxa" w:w="1368"/>
+            <w:tcW w:type="dxa" w:w="1469"/>
             <w:vAlign w:val="center"/>
             <w:shd w:fill="FFFFFF"/>
           </w:tcPr>
@@ -1559,7 +1074,7 @@
         </w:tc>
         <w:tc>
           <w:tcPr>
-            <w:tcW w:type="dxa" w:w="5242"/>
+            <w:tcW w:type="dxa" w:w="5170"/>
             <w:vAlign w:val="center"/>
             <w:shd w:fill="FFFFFF"/>
           </w:tcPr>
@@ -1586,7 +1101,7 @@
         </w:trPr>
         <w:tc>
           <w:tcPr>
-            <w:tcW w:type="dxa" w:w="2246"/>
+            <w:tcW w:type="dxa" w:w="2261"/>
             <w:vAlign w:val="center"/>
             <w:shd w:fill="EEF3F7"/>
           </w:tcPr>
@@ -1602,13 +1117,13 @@
                 <w:color w:val="000000"/>
                 <w:sz w:val="19"/>
               </w:rPr>
-              <w:t>Sunny Optical / 2382</w:t>
+              <w:t>Sunny Optical 2382</w:t>
             </w:r>
           </w:p>
         </w:tc>
         <w:tc>
           <w:tcPr>
-            <w:tcW w:type="dxa" w:w="1152"/>
+            <w:tcW w:type="dxa" w:w="1109"/>
             <w:vAlign w:val="center"/>
             <w:shd w:fill="EEF3F7"/>
           </w:tcPr>
@@ -1630,7 +1145,7 @@
         </w:tc>
         <w:tc>
           <w:tcPr>
-            <w:tcW w:type="dxa" w:w="1368"/>
+            <w:tcW w:type="dxa" w:w="1469"/>
             <w:vAlign w:val="center"/>
             <w:shd w:fill="EEF3F7"/>
           </w:tcPr>
@@ -1652,7 +1167,7 @@
         </w:tc>
         <w:tc>
           <w:tcPr>
-            <w:tcW w:type="dxa" w:w="5242"/>
+            <w:tcW w:type="dxa" w:w="5170"/>
             <w:vAlign w:val="center"/>
             <w:shd w:fill="EEF3F7"/>
           </w:tcPr>
@@ -1668,7 +1183,7 @@
                 <w:color w:val="000000"/>
                 <w:sz w:val="19"/>
               </w:rPr>
-              <w:t>Optical components; sector context, weakest business match</w:t>
+              <w:t>Optical components; weaker business match</w:t>
             </w:r>
           </w:p>
         </w:tc>
@@ -1683,15 +1198,15 @@
       <w:r>
         <w:rPr>
           <w:b/>
-          <w:sz w:val="19"/>
+          <w:sz w:val="18"/>
         </w:rPr>
-        <w:t>Anker deserves inclusion, but not a blanket premium:</w:t>
+        <w:t>Anker is relevant to Transsion’s brand/channel expansion,</w:t>
       </w:r>
       <w:r>
         <w:rPr>
-          <w:sz w:val="19"/>
+          <w:sz w:val="18"/>
         </w:rPr>
-        <w:t xml:space="preserve"> H1 revenue rose 29.1%; reported gross margin reached 49.82%, with prior-year IEEPA tariff refunds reducing current cost of sales. Fair-value gains also helped reported profit. Its 18.5× is a reference, not a clean margin or multiple target for Transsion. [20]</w:t>
+        <w:t xml:space="preserve"> but its margin is not a target: H1 reported gross margin of 49.82% benefited from prior-year IEEPA tariff refunds, and fair-value gains helped profit. Its 18.5× is a reported-earnings reference. [12]</w:t>
       </w:r>
     </w:p>
     <w:p>
@@ -1699,7 +1214,7 @@
         <w:rPr>
           <w:sz w:val="17"/>
         </w:rPr>
-        <w:t>* Lenovo: reported / adjusted non-GAAP P/E. Warrant fair-value charges depress reported TTM profit; exclude the reported 72.5× from a simple peer average. Other ratios use reported owner profit. Peer filings and price histories are linked on the source page.</w:t>
+        <w:t>* Lenovo: reported / adjusted non-GAAP P/E. Warrant fair-value charges depress reported profit; exclude 72.5× from a simple peer average. Other ratios use reported profit attributable to owners. Price and filing links are on page 4.</w:t>
       </w:r>
     </w:p>
     <w:p>
@@ -1707,7 +1222,7 @@
         <w:pStyle w:val="Caption"/>
       </w:pPr>
       <w:r>
-        <w:t>Transsion | existing A versus the H offer</w:t>
+        <w:t>Transsion A valuation and H offer valuation</w:t>
       </w:r>
     </w:p>
     <w:tbl>
@@ -2444,7 +1959,7 @@
         <w:rPr>
           <w:sz w:val="17"/>
         </w:rPr>
-        <w:t>A close is 30 Sep; H closes are 6 Oct. These are dated comparison inputs, not 8 Oct live quotes. FX: RMB1 = HK$1.1705; US$1 = HK$7.848. H equity value applies the offer price to all 1.2378bn post-issue shares, excluding greenshoe; existing A uses 1.1512bn pre-issue shares.</w:t>
+        <w:t>A input is the 30 Sep close; H inputs are 6 Oct closes, not 8 Oct live quotes. FX: RMB1 = HK$1.1705; US$1 = HK$7.848. H equity value applies the offer price to all 1.2378bn post-issue shares, excluding greenshoe; existing A uses 1.1512bn pre-issue shares. [1, 11]</w:t>
       </w:r>
     </w:p>
     <w:p>
@@ -2452,7 +1967,7 @@
         <w:rPr>
           <w:sz w:val="17"/>
         </w:rPr>
-        <w:t>At unchanged A price and the same enlarged share count, A TTM P/E would be 21.2×. H discount is 38.4–43.9%; midpoint 41.2%. Anker/Huaqin/Longcheer H discounts to A are about 22.5%/25.3%/51.0%. These differences are not arbitrage profits: A/H shares are not freely interchangeable.</w:t>
+        <w:t>At unchanged A price on enlarged capital, A TTM P/E would be 21.2×. H discount is 38.4–43.9%; midpoint 41.2%. Anker/Huaqin/Longcheer H discounts are about 22.5%/25.3%/51.0%. A/H shares are not freely interchangeable, so the discount is not a mechanical arbitrage return.</w:t>
       </w:r>
     </w:p>
     <w:p>
@@ -2460,7 +1975,22 @@
         <w:rPr>
           <w:sz w:val="17"/>
         </w:rPr>
-        <w:t>2026E: 12-institution owner-profit mean RMB3.557bn as of 3 Oct; range RMB2.856–4.228bn. Midpoint forward P/E spans 13.7–9.3× across that range. TTM = FY25 + H1 26 − H1 25; Lenovo’s March year end gives TTM to June 2026. Anker uses 589.464m shares verified through 18 Sep; small later conversions can change ratios marginally. [4, 19–21]</w:t>
+        <w:t>2026E: 12-institution owner-profit mean RMB3.557bn as of 3 Oct; range RMB2.856–4.228bn. Midpoint forward P/E spans 13.7–9.3× across that range. TTM = FY25 + H1 26 − H1 25; Lenovo follows its March year end. Anker uses 589.464m shares verified through 18 Sep. [4, 12, 13]</w:t>
+      </w:r>
+    </w:p>
+    <w:p>
+      <w:r>
+        <w:rPr>
+          <w:b/>
+          <w:sz w:val="17"/>
+        </w:rPr>
+        <w:t>Price sensitivity:</w:t>
+      </w:r>
+      <w:r>
+        <w:rPr>
+          <w:sz w:val="17"/>
+        </w:rPr>
+        <w:t xml:space="preserve"> at FY26 consensus and chosen 12–14× P/E, implied value is HK$40.36–47.09 (+9% to +27% from midpoint). At FY25 profit and 10×, it is HK$24.40 (−34%). These are illustrative scenarios, not price targets; use enlarged shares and the FX above, excluding dividends and greenshoe.</w:t>
       </w:r>
     </w:p>
     <w:p>
@@ -2470,14 +2000,16 @@
     </w:p>
     <w:p>
       <w:pPr>
-        <w:pStyle w:val="Caption"/>
-        <w:spacing w:before="180"/>
+        <w:pStyle w:val="Heading1"/>
+        <w:keepNext/>
+        <w:spacing w:before="160" w:after="100"/>
       </w:pPr>
       <w:r>
         <w:rPr>
+          <w:b/>
           <w:sz w:val="23"/>
         </w:rPr>
-        <w:t>Closest A references | retain, with clear labels</w:t>
+        <w:t>A share references and checks on the numbers</w:t>
       </w:r>
     </w:p>
     <w:p>
@@ -2485,7 +2017,7 @@
         <w:pStyle w:val="Caption"/>
       </w:pPr>
       <w:r>
-        <w:t>A closes 30 September 2026 | reported TTM P/E</w:t>
+        <w:t>Closest retained A references at 30 September 2026</w:t>
       </w:r>
     </w:p>
     <w:tbl>
@@ -2510,10 +2042,10 @@
         </w:tblCellMar>
       </w:tblPr>
       <w:tblGrid>
-        <w:gridCol w:w="2520"/>
-        <w:gridCol w:w="1224"/>
-        <w:gridCol w:w="1224"/>
-        <w:gridCol w:w="5040"/>
+        <w:gridCol w:w="2592"/>
+        <w:gridCol w:w="1152"/>
+        <w:gridCol w:w="1440"/>
+        <w:gridCol w:w="4824"/>
       </w:tblGrid>
       <w:tr>
         <w:trPr>
@@ -2522,7 +2054,7 @@
         </w:trPr>
         <w:tc>
           <w:tcPr>
-            <w:tcW w:type="dxa" w:w="2520"/>
+            <w:tcW w:type="dxa" w:w="2592"/>
             <w:vAlign w:val="center"/>
             <w:shd w:fill="233B53"/>
           </w:tcPr>
@@ -2538,13 +2070,13 @@
                 <w:color w:val="FFFFFF"/>
                 <w:sz w:val="19"/>
               </w:rPr>
-              <w:t>Company / A ticker</w:t>
+              <w:t>Company and A ticker</w:t>
             </w:r>
           </w:p>
         </w:tc>
         <w:tc>
           <w:tcPr>
-            <w:tcW w:type="dxa" w:w="1224"/>
+            <w:tcW w:type="dxa" w:w="1152"/>
             <w:vAlign w:val="center"/>
             <w:shd w:fill="233B53"/>
           </w:tcPr>
@@ -2568,7 +2100,7 @@
         </w:tc>
         <w:tc>
           <w:tcPr>
-            <w:tcW w:type="dxa" w:w="1224"/>
+            <w:tcW w:type="dxa" w:w="1440"/>
             <w:vAlign w:val="center"/>
             <w:shd w:fill="233B53"/>
           </w:tcPr>
@@ -2584,15 +2116,15 @@
                 <w:color w:val="FFFFFF"/>
                 <w:sz w:val="19"/>
               </w:rPr>
-              <w:t>TTM</w:t>
+              <w:t>Reported</w:t>
               <w:br/>
-              <w:t>P/E</w:t>
+              <w:t>TTM P/E</w:t>
             </w:r>
           </w:p>
         </w:tc>
         <w:tc>
           <w:tcPr>
-            <w:tcW w:type="dxa" w:w="5040"/>
+            <w:tcW w:type="dxa" w:w="4824"/>
             <w:vAlign w:val="center"/>
             <w:shd w:fill="233B53"/>
           </w:tcPr>
@@ -2608,7 +2140,7 @@
                 <w:color w:val="FFFFFF"/>
                 <w:sz w:val="19"/>
               </w:rPr>
-              <w:t>Why retain</w:t>
+              <w:t>Relevance</w:t>
             </w:r>
           </w:p>
         </w:tc>
@@ -2619,7 +2151,7 @@
         </w:trPr>
         <w:tc>
           <w:tcPr>
-            <w:tcW w:type="dxa" w:w="2520"/>
+            <w:tcW w:type="dxa" w:w="2592"/>
             <w:vAlign w:val="center"/>
             <w:shd w:fill="FFFFFF"/>
           </w:tcPr>
@@ -2635,13 +2167,13 @@
                 <w:color w:val="000000"/>
                 <w:sz w:val="19"/>
               </w:rPr>
-              <w:t>Anker / 300866</w:t>
+              <w:t>Anker 300866</w:t>
             </w:r>
           </w:p>
         </w:tc>
         <w:tc>
           <w:tcPr>
-            <w:tcW w:type="dxa" w:w="1224"/>
+            <w:tcW w:type="dxa" w:w="1152"/>
             <w:vAlign w:val="center"/>
             <w:shd w:fill="FFFFFF"/>
           </w:tcPr>
@@ -2663,7 +2195,7 @@
         </w:tc>
         <w:tc>
           <w:tcPr>
-            <w:tcW w:type="dxa" w:w="1224"/>
+            <w:tcW w:type="dxa" w:w="1440"/>
             <w:vAlign w:val="center"/>
             <w:shd w:fill="FFFFFF"/>
           </w:tcPr>
@@ -2685,7 +2217,7 @@
         </w:tc>
         <w:tc>
           <w:tcPr>
-            <w:tcW w:type="dxa" w:w="5040"/>
+            <w:tcW w:type="dxa" w:w="4824"/>
             <w:vAlign w:val="center"/>
             <w:shd w:fill="FFFFFF"/>
           </w:tcPr>
@@ -2701,7 +2233,7 @@
                 <w:color w:val="000000"/>
                 <w:sz w:val="19"/>
               </w:rPr>
-              <w:t>Overseas branded consumer hardware</w:t>
+              <w:t>Overseas branded consumer devices</w:t>
             </w:r>
           </w:p>
         </w:tc>
@@ -2712,7 +2244,7 @@
         </w:trPr>
         <w:tc>
           <w:tcPr>
-            <w:tcW w:type="dxa" w:w="2520"/>
+            <w:tcW w:type="dxa" w:w="2592"/>
             <w:vAlign w:val="center"/>
             <w:shd w:fill="EEF3F7"/>
           </w:tcPr>
@@ -2728,13 +2260,13 @@
                 <w:color w:val="000000"/>
                 <w:sz w:val="19"/>
               </w:rPr>
-              <w:t>Huaqin / 603296</w:t>
+              <w:t>Huaqin 603296</w:t>
             </w:r>
           </w:p>
         </w:tc>
         <w:tc>
           <w:tcPr>
-            <w:tcW w:type="dxa" w:w="1224"/>
+            <w:tcW w:type="dxa" w:w="1152"/>
             <w:vAlign w:val="center"/>
             <w:shd w:fill="EEF3F7"/>
           </w:tcPr>
@@ -2756,7 +2288,7 @@
         </w:tc>
         <w:tc>
           <w:tcPr>
-            <w:tcW w:type="dxa" w:w="1224"/>
+            <w:tcW w:type="dxa" w:w="1440"/>
             <w:vAlign w:val="center"/>
             <w:shd w:fill="EEF3F7"/>
           </w:tcPr>
@@ -2778,7 +2310,7 @@
         </w:tc>
         <w:tc>
           <w:tcPr>
-            <w:tcW w:type="dxa" w:w="5040"/>
+            <w:tcW w:type="dxa" w:w="4824"/>
             <w:vAlign w:val="center"/>
             <w:shd w:fill="EEF3F7"/>
           </w:tcPr>
@@ -2794,7 +2326,7 @@
                 <w:color w:val="000000"/>
                 <w:sz w:val="19"/>
               </w:rPr>
-              <w:t>Large handset ODM; manufacturing benchmark</w:t>
+              <w:t>Handset/electronics ODM</w:t>
             </w:r>
           </w:p>
         </w:tc>
@@ -2805,7 +2337,7 @@
         </w:trPr>
         <w:tc>
           <w:tcPr>
-            <w:tcW w:type="dxa" w:w="2520"/>
+            <w:tcW w:type="dxa" w:w="2592"/>
             <w:vAlign w:val="center"/>
             <w:shd w:fill="FFFFFF"/>
           </w:tcPr>
@@ -2821,13 +2353,13 @@
                 <w:color w:val="000000"/>
                 <w:sz w:val="19"/>
               </w:rPr>
-              <w:t>Longcheer / 603341</w:t>
+              <w:t>Longcheer 603341</w:t>
             </w:r>
           </w:p>
         </w:tc>
         <w:tc>
           <w:tcPr>
-            <w:tcW w:type="dxa" w:w="1224"/>
+            <w:tcW w:type="dxa" w:w="1152"/>
             <w:vAlign w:val="center"/>
             <w:shd w:fill="FFFFFF"/>
           </w:tcPr>
@@ -2849,7 +2381,7 @@
         </w:tc>
         <w:tc>
           <w:tcPr>
-            <w:tcW w:type="dxa" w:w="1224"/>
+            <w:tcW w:type="dxa" w:w="1440"/>
             <w:vAlign w:val="center"/>
             <w:shd w:fill="FFFFFF"/>
           </w:tcPr>
@@ -2871,7 +2403,7 @@
         </w:tc>
         <w:tc>
           <w:tcPr>
-            <w:tcW w:type="dxa" w:w="5040"/>
+            <w:tcW w:type="dxa" w:w="4824"/>
             <w:vAlign w:val="center"/>
             <w:shd w:fill="FFFFFF"/>
           </w:tcPr>
@@ -2887,7 +2419,7 @@
                 <w:color w:val="000000"/>
                 <w:sz w:val="19"/>
               </w:rPr>
-              <w:t>Smartphone ODM; manufacturing benchmark</w:t>
+              <w:t>Smartphone ODM</w:t>
             </w:r>
           </w:p>
         </w:tc>
@@ -2901,21 +2433,9 @@
     <w:p>
       <w:r>
         <w:rPr>
-          <w:sz w:val="18"/>
+          <w:sz w:val="17"/>
         </w:rPr>
-        <w:t>Xiaomi has no A listing. OPPO, vivo and Honor are operating competitors without listed equity valuations in this table. Anker and the ODMs are the most relevant retained A references, with the differences above; Transsion’s own A valuation is on page 2.</w:t>
-      </w:r>
-    </w:p>
-    <w:p>
-      <w:pPr>
-        <w:pStyle w:val="Caption"/>
-        <w:spacing w:before="180"/>
-      </w:pPr>
-      <w:r>
-        <w:rPr>
-          <w:sz w:val="23"/>
-        </w:rPr>
-        <w:t>Numbers checked | what matters for the trade</w:t>
+        <w:t>OPPO, vivo and Honor are operating rivals, with no listed valuation used here. Xiaomi has no A listing. Anker and the ODMs are reference businesses, with the differences above; Transsion’s own A comparison is on page 2.</w:t>
       </w:r>
     </w:p>
     <w:p>
@@ -2923,7 +2443,7 @@
         <w:pStyle w:val="Caption"/>
       </w:pPr>
       <w:r>
-        <w:t>Cash and margin audit | RMB bn except margins</w:t>
+        <w:t>Financial reconciliation in RMB billions except margins</w:t>
       </w:r>
     </w:p>
     <w:tbl>
@@ -2948,10 +2468,10 @@
         </w:tblCellMar>
       </w:tblPr>
       <w:tblGrid>
-        <w:gridCol w:w="2347"/>
-        <w:gridCol w:w="1613"/>
-        <w:gridCol w:w="1786"/>
-        <w:gridCol w:w="4262"/>
+        <w:gridCol w:w="2376"/>
+        <w:gridCol w:w="1627"/>
+        <w:gridCol w:w="1728"/>
+        <w:gridCol w:w="4277"/>
       </w:tblGrid>
       <w:tr>
         <w:trPr>
@@ -2960,7 +2480,7 @@
         </w:trPr>
         <w:tc>
           <w:tcPr>
-            <w:tcW w:type="dxa" w:w="2347"/>
+            <w:tcW w:type="dxa" w:w="2376"/>
             <w:vAlign w:val="center"/>
             <w:shd w:fill="233B53"/>
           </w:tcPr>
@@ -2982,7 +2502,7 @@
         </w:tc>
         <w:tc>
           <w:tcPr>
-            <w:tcW w:type="dxa" w:w="1613"/>
+            <w:tcW w:type="dxa" w:w="1627"/>
             <w:vAlign w:val="center"/>
             <w:shd w:fill="233B53"/>
           </w:tcPr>
@@ -2998,13 +2518,13 @@
                 <w:color w:val="FFFFFF"/>
                 <w:sz w:val="19"/>
               </w:rPr>
-              <w:t>FY25 / Dec25</w:t>
+              <w:t>FY25 or Dec25</w:t>
             </w:r>
           </w:p>
         </w:tc>
         <w:tc>
           <w:tcPr>
-            <w:tcW w:type="dxa" w:w="1786"/>
+            <w:tcW w:type="dxa" w:w="1728"/>
             <w:vAlign w:val="center"/>
             <w:shd w:fill="233B53"/>
           </w:tcPr>
@@ -3020,13 +2540,13 @@
                 <w:color w:val="FFFFFF"/>
                 <w:sz w:val="19"/>
               </w:rPr>
-              <w:t>H1 / Jun26</w:t>
+              <w:t>H1 or Jun26</w:t>
             </w:r>
           </w:p>
         </w:tc>
         <w:tc>
           <w:tcPr>
-            <w:tcW w:type="dxa" w:w="4262"/>
+            <w:tcW w:type="dxa" w:w="4277"/>
             <w:vAlign w:val="center"/>
             <w:shd w:fill="233B53"/>
           </w:tcPr>
@@ -3042,7 +2562,7 @@
                 <w:color w:val="FFFFFF"/>
                 <w:sz w:val="19"/>
               </w:rPr>
-              <w:t>Implication</w:t>
+              <w:t>Interpretation</w:t>
             </w:r>
           </w:p>
         </w:tc>
@@ -3053,7 +2573,7 @@
         </w:trPr>
         <w:tc>
           <w:tcPr>
-            <w:tcW w:type="dxa" w:w="2347"/>
+            <w:tcW w:type="dxa" w:w="2376"/>
             <w:vAlign w:val="center"/>
             <w:shd w:fill="FFFFFF"/>
           </w:tcPr>
@@ -3075,7 +2595,7 @@
         </w:tc>
         <w:tc>
           <w:tcPr>
-            <w:tcW w:type="dxa" w:w="1613"/>
+            <w:tcW w:type="dxa" w:w="1627"/>
             <w:vAlign w:val="center"/>
             <w:shd w:fill="FFFFFF"/>
           </w:tcPr>
@@ -3097,7 +2617,7 @@
         </w:tc>
         <w:tc>
           <w:tcPr>
-            <w:tcW w:type="dxa" w:w="1786"/>
+            <w:tcW w:type="dxa" w:w="1728"/>
             <w:vAlign w:val="center"/>
             <w:shd w:fill="FFFFFF"/>
           </w:tcPr>
@@ -3119,7 +2639,7 @@
         </w:tc>
         <w:tc>
           <w:tcPr>
-            <w:tcW w:type="dxa" w:w="4262"/>
+            <w:tcW w:type="dxa" w:w="4277"/>
             <w:vAlign w:val="center"/>
             <w:shd w:fill="FFFFFF"/>
           </w:tcPr>
@@ -3135,7 +2655,7 @@
                 <w:color w:val="000000"/>
                 <w:sz w:val="19"/>
               </w:rPr>
-              <w:t>Use owner profit for P/E, not FY25 consolidated 2.605</w:t>
+              <w:t>P/E uses owner profit; FY25 net profit including minorities was 2.605</w:t>
             </w:r>
           </w:p>
         </w:tc>
@@ -3146,7 +2666,7 @@
         </w:trPr>
         <w:tc>
           <w:tcPr>
-            <w:tcW w:type="dxa" w:w="2347"/>
+            <w:tcW w:type="dxa" w:w="2376"/>
             <w:vAlign w:val="center"/>
             <w:shd w:fill="EEF3F7"/>
           </w:tcPr>
@@ -3162,13 +2682,13 @@
                 <w:color w:val="000000"/>
                 <w:sz w:val="19"/>
               </w:rPr>
-              <w:t>Group gross margin: A / H</w:t>
+              <w:t>Group margin A / H basis</w:t>
             </w:r>
           </w:p>
         </w:tc>
         <w:tc>
           <w:tcPr>
-            <w:tcW w:type="dxa" w:w="1613"/>
+            <w:tcW w:type="dxa" w:w="1627"/>
             <w:vAlign w:val="center"/>
             <w:shd w:fill="EEF3F7"/>
           </w:tcPr>
@@ -3190,7 +2710,7 @@
         </w:tc>
         <w:tc>
           <w:tcPr>
-            <w:tcW w:type="dxa" w:w="1786"/>
+            <w:tcW w:type="dxa" w:w="1728"/>
             <w:vAlign w:val="center"/>
             <w:shd w:fill="EEF3F7"/>
           </w:tcPr>
@@ -3212,7 +2732,7 @@
         </w:tc>
         <w:tc>
           <w:tcPr>
-            <w:tcW w:type="dxa" w:w="4262"/>
+            <w:tcW w:type="dxa" w:w="4277"/>
             <w:vAlign w:val="center"/>
             <w:shd w:fill="EEF3F7"/>
           </w:tcPr>
@@ -3228,7 +2748,7 @@
                 <w:color w:val="000000"/>
                 <w:sz w:val="19"/>
               </w:rPr>
-              <w:t>Inventory write-down presentation explains gap; net profit unchanged</w:t>
+              <w:t>Different inventory impairment presentation</w:t>
             </w:r>
           </w:p>
         </w:tc>
@@ -3239,7 +2759,7 @@
         </w:trPr>
         <w:tc>
           <w:tcPr>
-            <w:tcW w:type="dxa" w:w="2347"/>
+            <w:tcW w:type="dxa" w:w="2376"/>
             <w:vAlign w:val="center"/>
             <w:shd w:fill="FFFFFF"/>
           </w:tcPr>
@@ -3261,7 +2781,7 @@
         </w:tc>
         <w:tc>
           <w:tcPr>
-            <w:tcW w:type="dxa" w:w="1613"/>
+            <w:tcW w:type="dxa" w:w="1627"/>
             <w:vAlign w:val="center"/>
             <w:shd w:fill="FFFFFF"/>
           </w:tcPr>
@@ -3283,7 +2803,7 @@
         </w:tc>
         <w:tc>
           <w:tcPr>
-            <w:tcW w:type="dxa" w:w="1786"/>
+            <w:tcW w:type="dxa" w:w="1728"/>
             <w:vAlign w:val="center"/>
             <w:shd w:fill="FFFFFF"/>
           </w:tcPr>
@@ -3305,7 +2825,7 @@
         </w:tc>
         <w:tc>
           <w:tcPr>
-            <w:tcW w:type="dxa" w:w="4262"/>
+            <w:tcW w:type="dxa" w:w="4277"/>
             <w:vAlign w:val="center"/>
             <w:shd w:fill="FFFFFF"/>
           </w:tcPr>
@@ -3332,7 +2852,7 @@
         </w:trPr>
         <w:tc>
           <w:tcPr>
-            <w:tcW w:type="dxa" w:w="2347"/>
+            <w:tcW w:type="dxa" w:w="2376"/>
             <w:vAlign w:val="center"/>
             <w:shd w:fill="EEF3F7"/>
           </w:tcPr>
@@ -3354,7 +2874,7 @@
         </w:tc>
         <w:tc>
           <w:tcPr>
-            <w:tcW w:type="dxa" w:w="1613"/>
+            <w:tcW w:type="dxa" w:w="1627"/>
             <w:vAlign w:val="center"/>
             <w:shd w:fill="EEF3F7"/>
           </w:tcPr>
@@ -3376,7 +2896,7 @@
         </w:tc>
         <w:tc>
           <w:tcPr>
-            <w:tcW w:type="dxa" w:w="1786"/>
+            <w:tcW w:type="dxa" w:w="1728"/>
             <w:vAlign w:val="center"/>
             <w:shd w:fill="EEF3F7"/>
           </w:tcPr>
@@ -3398,7 +2918,7 @@
         </w:tc>
         <w:tc>
           <w:tcPr>
-            <w:tcW w:type="dxa" w:w="4262"/>
+            <w:tcW w:type="dxa" w:w="4277"/>
             <w:vAlign w:val="center"/>
             <w:shd w:fill="EEF3F7"/>
           </w:tcPr>
@@ -3414,7 +2934,7 @@
                 <w:color w:val="000000"/>
                 <w:sz w:val="19"/>
               </w:rPr>
-              <w:t>Mostly component prebuying; memory amount undisclosed</w:t>
+              <w:t>Memory subset is not separately disclosed</w:t>
             </w:r>
           </w:p>
         </w:tc>
@@ -3425,7 +2945,7 @@
         </w:trPr>
         <w:tc>
           <w:tcPr>
-            <w:tcW w:type="dxa" w:w="2347"/>
+            <w:tcW w:type="dxa" w:w="2376"/>
             <w:vAlign w:val="center"/>
             <w:shd w:fill="FFFFFF"/>
           </w:tcPr>
@@ -3441,13 +2961,13 @@
                 <w:color w:val="000000"/>
                 <w:sz w:val="19"/>
               </w:rPr>
-              <w:t>Cash equivalents / bank loans</w:t>
+              <w:t>Cash / bank loans</w:t>
             </w:r>
           </w:p>
         </w:tc>
         <w:tc>
           <w:tcPr>
-            <w:tcW w:type="dxa" w:w="1613"/>
+            <w:tcW w:type="dxa" w:w="1627"/>
             <w:vAlign w:val="center"/>
             <w:shd w:fill="FFFFFF"/>
           </w:tcPr>
@@ -3469,7 +2989,7 @@
         </w:tc>
         <w:tc>
           <w:tcPr>
-            <w:tcW w:type="dxa" w:w="1786"/>
+            <w:tcW w:type="dxa" w:w="1728"/>
             <w:vAlign w:val="center"/>
             <w:shd w:fill="FFFFFF"/>
           </w:tcPr>
@@ -3491,7 +3011,7 @@
         </w:tc>
         <w:tc>
           <w:tcPr>
-            <w:tcW w:type="dxa" w:w="4262"/>
+            <w:tcW w:type="dxa" w:w="4277"/>
             <w:vAlign w:val="center"/>
             <w:shd w:fill="FFFFFF"/>
           </w:tcPr>
@@ -3507,7 +3027,7 @@
                 <w:color w:val="000000"/>
                 <w:sz w:val="19"/>
               </w:rPr>
-              <w:t>Zero-debt claims are incorrect</w:t>
+              <w:t>Cash buffer remains; debt is not zero</w:t>
             </w:r>
           </w:p>
         </w:tc>
@@ -3519,162 +3039,594 @@
       </w:pPr>
     </w:p>
     <w:p>
-      <w:pPr>
-        <w:pStyle w:val="ListBullet"/>
-        <w:spacing w:after="100" w:line="254" w:lineRule="auto"/>
-        <w:ind w:left="230" w:hanging="187"/>
-      </w:pPr>
       <w:r>
         <w:rPr>
-          <w:rFonts w:ascii="Arial" w:hAnsi="Arial"/>
           <w:b/>
-          <w:sz w:val="20"/>
+          <w:sz w:val="17"/>
         </w:rPr>
-        <w:t xml:space="preserve">Cash answer: </w:t>
+        <w:t>A/H margin reconciliation:</w:t>
       </w:r>
       <w:r>
         <w:rPr>
-          <w:rFonts w:ascii="Arial" w:hAnsi="Arial"/>
-          <w:sz w:val="20"/>
+          <w:sz w:val="17"/>
         </w:rPr>
-        <w:t>Inventory explains much of the drain, not memory alone. The H1 cash bridge shows inventory −10.41bn, receivables −1.66bn and payables +3.53bn. Watch whether stock unwinds into cash rather than further borrowing. [3]</w:t>
-      </w:r>
-    </w:p>
-    <w:p>
-      <w:pPr>
-        <w:pStyle w:val="ListBullet"/>
-        <w:spacing w:after="100" w:line="254" w:lineRule="auto"/>
-        <w:ind w:left="230" w:hanging="187"/>
-      </w:pPr>
-      <w:r>
-        <w:rPr>
-          <w:rFonts w:ascii="Arial" w:hAnsi="Arial"/>
-          <w:b/>
-          <w:sz w:val="20"/>
-        </w:rPr>
-        <w:t xml:space="preserve">Margin answer: </w:t>
-      </w:r>
-      <w:r>
-        <w:rPr>
-          <w:rFonts w:ascii="Arial" w:hAnsi="Arial"/>
-          <w:sz w:val="20"/>
-        </w:rPr>
-        <w:t>FY25 18.43% is the A phone-segment margin, not group margin. H accounts include inventory write-downs in cost of sales; A accounts record impairment separately. Replacement-stock margins are the economic issue. [1–3]</w:t>
-      </w:r>
-    </w:p>
-    <w:p>
-      <w:pPr>
-        <w:pStyle w:val="ListBullet"/>
-        <w:spacing w:after="100" w:line="254" w:lineRule="auto"/>
-        <w:ind w:left="230" w:hanging="187"/>
-      </w:pPr>
-      <w:r>
-        <w:rPr>
-          <w:rFonts w:ascii="Arial" w:hAnsi="Arial"/>
-          <w:b/>
-          <w:sz w:val="20"/>
-        </w:rPr>
-        <w:t xml:space="preserve">Other earnings checks: </w:t>
-      </w:r>
-      <w:r>
-        <w:rPr>
-          <w:rFonts w:ascii="Arial" w:hAnsi="Arial"/>
-          <w:sz w:val="20"/>
-        </w:rPr>
-        <w:t>H1 ex-nonrecurring profit was RMB1.48bn versus RMB1.77bn reported; FX losses reached RMB390m. FY25 selling costs RMB5.204bn (+7.61%) and R&amp;D RMB2.950bn (+17.23%) reconcile to filings. Brand spend, currency losses and royalties can absorb margin recovery. [1–3]</w:t>
-      </w:r>
-    </w:p>
-    <w:p>
-      <w:pPr>
-        <w:pStyle w:val="Caption"/>
-        <w:spacing w:before="180"/>
-      </w:pPr>
-      <w:r>
-        <w:rPr>
-          <w:sz w:val="23"/>
-        </w:rPr>
-        <w:t>Broker and retail read | constructive, with a cash/margin split</w:t>
-      </w:r>
-    </w:p>
-    <w:p>
-      <w:pPr>
-        <w:pStyle w:val="ListBullet"/>
-        <w:spacing w:after="100" w:line="254" w:lineRule="auto"/>
-        <w:ind w:left="230" w:hanging="187"/>
-      </w:pPr>
-      <w:r>
-        <w:rPr>
-          <w:rFonts w:ascii="Arial" w:hAnsi="Arial"/>
-          <w:b/>
-          <w:sz w:val="20"/>
-        </w:rPr>
-        <w:t xml:space="preserve">Brokers: </w:t>
-      </w:r>
-      <w:r>
-        <w:rPr>
-          <w:rFonts w:ascii="Arial" w:hAnsi="Arial"/>
-          <w:sz w:val="20"/>
-        </w:rPr>
-        <w:t>Kaiyuan Buy / RMB3.683bn FY26 profit; Guolian Minsheng Recommend / 3.750bn; Zhongtai Buy / 3.187bn. Their thesis is ASP/mix and recovery. Forecast dispersion argues against treating 2026 consensus as guaranteed. [5–7]</w:t>
-      </w:r>
-    </w:p>
-    <w:p>
-      <w:pPr>
-        <w:pStyle w:val="ListBullet"/>
-        <w:spacing w:after="100" w:line="254" w:lineRule="auto"/>
-        <w:ind w:left="230" w:hanging="187"/>
-      </w:pPr>
-      <w:r>
-        <w:rPr>
-          <w:rFonts w:ascii="Arial" w:hAnsi="Arial"/>
-          <w:b/>
-          <w:sz w:val="20"/>
-        </w:rPr>
-        <w:t xml:space="preserve">Xueqiu: </w:t>
-      </w:r>
-      <w:r>
-        <w:rPr>
-          <w:rFonts w:ascii="Arial" w:hAnsi="Arial"/>
-          <w:sz w:val="20"/>
-        </w:rPr>
-        <w:t>Bulls cite a cyclical earnings bottom, channels and prebuying; bears question memory costs, stock build and sustainable margins. The sampled posts are anecdotal and mostly predate H bookbuilding. A zero-debt bull premise fails the accounts. [11–14]</w:t>
-      </w:r>
-    </w:p>
-    <w:p>
-      <w:pPr>
-        <w:pStyle w:val="ListBullet"/>
-        <w:spacing w:after="100" w:line="254" w:lineRule="auto"/>
-        <w:ind w:left="230" w:hanging="187"/>
-      </w:pPr>
-      <w:r>
-        <w:rPr>
-          <w:rFonts w:ascii="Arial" w:hAnsi="Arial"/>
-          <w:b/>
-          <w:sz w:val="20"/>
-        </w:rPr>
-        <w:t xml:space="preserve">Niuniu: </w:t>
-      </w:r>
-      <w:r>
-        <w:rPr>
-          <w:rFonts w:ascii="Arial" w:hAnsi="Arial"/>
-          <w:sz w:val="20"/>
-        </w:rPr>
-        <w:t>The public H forum showed no comments on 7 Oct; A discussion required login. Media commentary is available, but no representative retail subscription consensus was established. Do not substitute forum tone for book data. [15–18]</w:t>
+        <w:t xml:space="preserve"> H cost of sales includes inventory write-downs; A accounts record impairment separately. Net profit is unchanged. FY25 18.43% is the A phone-segment margin, not group margin. H1 other-category margin 29.09% and smartphone margin 21.32% are calculated from A-report revenue/cost, p.142. [1–3]</w:t>
       </w:r>
     </w:p>
     <w:p>
       <w:r>
         <w:rPr>
           <w:b/>
-          <w:sz w:val="19"/>
+          <w:sz w:val="17"/>
         </w:rPr>
-        <w:t>Trade trigger:</w:t>
+        <w:t>Cash bridge:</w:t>
       </w:r>
       <w:r>
         <w:rPr>
-          <w:sz w:val="19"/>
+          <w:sz w:val="17"/>
         </w:rPr>
-        <w:t xml:space="preserve"> firmer conviction requires margin resilience and inventory converting into cash. Weak margins with stock still elevated would invalidate the recovery case. At the upper offer price, require stronger book evidence to compensate for the narrower valuation cushion.</w:t>
+        <w:t xml:space="preserve"> inventory −RMB10.41bn, receivables −1.66bn and payables +3.53bn contributed to −5.86bn OCF. Inventory buying explains much of the outflow, but does not establish that every yuan bought memory. H1 ex-nonrecurring owner profit was RMB1.48bn versus 1.77bn reported. [3]</w:t>
+      </w:r>
+    </w:p>
+    <w:p>
+      <w:pPr>
+        <w:pStyle w:val="Caption"/>
+      </w:pPr>
+      <w:r>
+        <w:t>Selected cornerstone investors and their investment type</w:t>
+      </w:r>
+    </w:p>
+    <w:tbl>
+      <w:tblPr>
+        <w:tblW w:type="auto" w:w="0"/>
+        <w:jc w:val="center"/>
+        <w:tblLayout w:type="fixed"/>
+        <w:tblLook w:firstColumn="1" w:firstRow="1" w:lastColumn="0" w:lastRow="0" w:noHBand="0" w:noVBand="1" w:val="04A0"/>
+        <w:tblBorders>
+          <w:top w:val="single" w:sz="5" w:color="D9D9D9"/>
+          <w:left w:val="single" w:sz="5" w:color="D9D9D9"/>
+          <w:bottom w:val="single" w:sz="5" w:color="D9D9D9"/>
+          <w:right w:val="single" w:sz="5" w:color="D9D9D9"/>
+          <w:insideH w:val="single" w:sz="5" w:color="D9D9D9"/>
+          <w:insideV w:val="single" w:sz="5" w:color="D9D9D9"/>
+        </w:tblBorders>
+        <w:tblCellMar>
+          <w:top w:w="88" w:type="dxa"/>
+          <w:bottom w:w="88" w:type="dxa"/>
+          <w:left w:w="110" w:type="dxa"/>
+          <w:right w:w="110" w:type="dxa"/>
+        </w:tblCellMar>
+      </w:tblPr>
+      <w:tblGrid>
+        <w:gridCol w:w="2376"/>
+        <w:gridCol w:w="1872"/>
+        <w:gridCol w:w="5760"/>
+      </w:tblGrid>
+      <w:tr>
+        <w:trPr>
+          <w:tblHeader/>
+          <w:cantSplit/>
+        </w:trPr>
+        <w:tc>
+          <w:tcPr>
+            <w:tcW w:type="dxa" w:w="2376"/>
+            <w:vAlign w:val="center"/>
+            <w:shd w:fill="233B53"/>
+          </w:tcPr>
+          <w:p>
+            <w:pPr>
+              <w:spacing w:after="0" w:before="0" w:line="250" w:lineRule="auto"/>
+              <w:jc w:val="left"/>
+            </w:pPr>
+            <w:r>
+              <w:rPr>
+                <w:rFonts w:ascii="Arial" w:hAnsi="Arial"/>
+                <w:b/>
+                <w:color w:val="FFFFFF"/>
+                <w:sz w:val="19"/>
+              </w:rPr>
+              <w:t>Investor</w:t>
+            </w:r>
+          </w:p>
+        </w:tc>
+        <w:tc>
+          <w:tcPr>
+            <w:tcW w:type="dxa" w:w="1872"/>
+            <w:vAlign w:val="center"/>
+            <w:shd w:fill="233B53"/>
+          </w:tcPr>
+          <w:p>
+            <w:pPr>
+              <w:spacing w:after="0" w:before="0" w:line="250" w:lineRule="auto"/>
+              <w:jc w:val="center"/>
+            </w:pPr>
+            <w:r>
+              <w:rPr>
+                <w:rFonts w:ascii="Arial" w:hAnsi="Arial"/>
+                <w:b/>
+                <w:color w:val="FFFFFF"/>
+                <w:sz w:val="19"/>
+              </w:rPr>
+              <w:t>Commitment</w:t>
+            </w:r>
+          </w:p>
+        </w:tc>
+        <w:tc>
+          <w:tcPr>
+            <w:tcW w:type="dxa" w:w="5760"/>
+            <w:vAlign w:val="center"/>
+            <w:shd w:fill="233B53"/>
+          </w:tcPr>
+          <w:p>
+            <w:pPr>
+              <w:spacing w:after="0" w:before="0" w:line="250" w:lineRule="auto"/>
+              <w:jc w:val="left"/>
+            </w:pPr>
+            <w:r>
+              <w:rPr>
+                <w:rFonts w:ascii="Arial" w:hAnsi="Arial"/>
+                <w:b/>
+                <w:color w:val="FFFFFF"/>
+                <w:sz w:val="19"/>
+              </w:rPr>
+              <w:t>Type and significance</w:t>
+            </w:r>
+          </w:p>
+        </w:tc>
+      </w:tr>
+      <w:tr>
+        <w:trPr>
+          <w:cantSplit/>
+        </w:trPr>
+        <w:tc>
+          <w:tcPr>
+            <w:tcW w:type="dxa" w:w="2376"/>
+            <w:vAlign w:val="center"/>
+            <w:shd w:fill="FFFFFF"/>
+          </w:tcPr>
+          <w:p>
+            <w:pPr>
+              <w:spacing w:after="0" w:before="0" w:line="250" w:lineRule="auto"/>
+              <w:jc w:val="left"/>
+            </w:pPr>
+            <w:r>
+              <w:rPr>
+                <w:rFonts w:ascii="Arial" w:hAnsi="Arial"/>
+                <w:b w:val="0"/>
+                <w:color w:val="000000"/>
+                <w:sz w:val="19"/>
+              </w:rPr>
+              <w:t>Longsys</w:t>
+            </w:r>
+          </w:p>
+        </w:tc>
+        <w:tc>
+          <w:tcPr>
+            <w:tcW w:type="dxa" w:w="1872"/>
+            <w:vAlign w:val="center"/>
+            <w:shd w:fill="FFFFFF"/>
+          </w:tcPr>
+          <w:p>
+            <w:pPr>
+              <w:spacing w:after="0" w:before="0" w:line="250" w:lineRule="auto"/>
+              <w:jc w:val="center"/>
+            </w:pPr>
+            <w:r>
+              <w:rPr>
+                <w:rFonts w:ascii="Arial" w:hAnsi="Arial"/>
+                <w:b w:val="0"/>
+                <w:color w:val="000000"/>
+                <w:sz w:val="19"/>
+              </w:rPr>
+              <w:t>US$30m</w:t>
+            </w:r>
+          </w:p>
+        </w:tc>
+        <w:tc>
+          <w:tcPr>
+            <w:tcW w:type="dxa" w:w="5760"/>
+            <w:vAlign w:val="center"/>
+            <w:shd w:fill="FFFFFF"/>
+          </w:tcPr>
+          <w:p>
+            <w:pPr>
+              <w:spacing w:after="0" w:before="0" w:line="250" w:lineRule="auto"/>
+              <w:jc w:val="left"/>
+            </w:pPr>
+            <w:r>
+              <w:rPr>
+                <w:rFonts w:ascii="Arial" w:hAnsi="Arial"/>
+                <w:b w:val="0"/>
+                <w:color w:val="000000"/>
+                <w:sz w:val="19"/>
+              </w:rPr>
+              <w:t>Largest anchor; memory products supplier</w:t>
+            </w:r>
+          </w:p>
+        </w:tc>
+      </w:tr>
+      <w:tr>
+        <w:trPr>
+          <w:cantSplit/>
+        </w:trPr>
+        <w:tc>
+          <w:tcPr>
+            <w:tcW w:type="dxa" w:w="2376"/>
+            <w:vAlign w:val="center"/>
+            <w:shd w:fill="EEF3F7"/>
+          </w:tcPr>
+          <w:p>
+            <w:pPr>
+              <w:spacing w:after="0" w:before="0" w:line="250" w:lineRule="auto"/>
+              <w:jc w:val="left"/>
+            </w:pPr>
+            <w:r>
+              <w:rPr>
+                <w:rFonts w:ascii="Arial" w:hAnsi="Arial"/>
+                <w:b w:val="0"/>
+                <w:color w:val="000000"/>
+                <w:sz w:val="19"/>
+              </w:rPr>
+              <w:t>GoldenLink BYD affiliate</w:t>
+            </w:r>
+          </w:p>
+        </w:tc>
+        <w:tc>
+          <w:tcPr>
+            <w:tcW w:type="dxa" w:w="1872"/>
+            <w:vAlign w:val="center"/>
+            <w:shd w:fill="EEF3F7"/>
+          </w:tcPr>
+          <w:p>
+            <w:pPr>
+              <w:spacing w:after="0" w:before="0" w:line="250" w:lineRule="auto"/>
+              <w:jc w:val="center"/>
+            </w:pPr>
+            <w:r>
+              <w:rPr>
+                <w:rFonts w:ascii="Arial" w:hAnsi="Arial"/>
+                <w:b w:val="0"/>
+                <w:color w:val="000000"/>
+                <w:sz w:val="19"/>
+              </w:rPr>
+              <w:t>RMB150m</w:t>
+            </w:r>
+          </w:p>
+        </w:tc>
+        <w:tc>
+          <w:tcPr>
+            <w:tcW w:type="dxa" w:w="5760"/>
+            <w:vAlign w:val="center"/>
+            <w:shd w:fill="EEF3F7"/>
+          </w:tcPr>
+          <w:p>
+            <w:pPr>
+              <w:spacing w:after="0" w:before="0" w:line="250" w:lineRule="auto"/>
+              <w:jc w:val="left"/>
+            </w:pPr>
+            <w:r>
+              <w:rPr>
+                <w:rFonts w:ascii="Arial" w:hAnsi="Arial"/>
+                <w:b w:val="0"/>
+                <w:color w:val="000000"/>
+                <w:sz w:val="19"/>
+              </w:rPr>
+              <w:t>Industrial investor; battery/energy adjacency</w:t>
+            </w:r>
+          </w:p>
+        </w:tc>
+      </w:tr>
+      <w:tr>
+        <w:trPr>
+          <w:cantSplit/>
+        </w:trPr>
+        <w:tc>
+          <w:tcPr>
+            <w:tcW w:type="dxa" w:w="2376"/>
+            <w:vAlign w:val="center"/>
+            <w:shd w:fill="FFFFFF"/>
+          </w:tcPr>
+          <w:p>
+            <w:pPr>
+              <w:spacing w:after="0" w:before="0" w:line="250" w:lineRule="auto"/>
+              <w:jc w:val="left"/>
+            </w:pPr>
+            <w:r>
+              <w:rPr>
+                <w:rFonts w:ascii="Arial" w:hAnsi="Arial"/>
+                <w:b w:val="0"/>
+                <w:color w:val="000000"/>
+                <w:sz w:val="19"/>
+              </w:rPr>
+              <w:t>Digimoc MediaTek</w:t>
+            </w:r>
+          </w:p>
+        </w:tc>
+        <w:tc>
+          <w:tcPr>
+            <w:tcW w:type="dxa" w:w="1872"/>
+            <w:vAlign w:val="center"/>
+            <w:shd w:fill="FFFFFF"/>
+          </w:tcPr>
+          <w:p>
+            <w:pPr>
+              <w:spacing w:after="0" w:before="0" w:line="250" w:lineRule="auto"/>
+              <w:jc w:val="center"/>
+            </w:pPr>
+            <w:r>
+              <w:rPr>
+                <w:rFonts w:ascii="Arial" w:hAnsi="Arial"/>
+                <w:b w:val="0"/>
+                <w:color w:val="000000"/>
+                <w:sz w:val="19"/>
+              </w:rPr>
+              <w:t>US$9m</w:t>
+            </w:r>
+          </w:p>
+        </w:tc>
+        <w:tc>
+          <w:tcPr>
+            <w:tcW w:type="dxa" w:w="5760"/>
+            <w:vAlign w:val="center"/>
+            <w:shd w:fill="FFFFFF"/>
+          </w:tcPr>
+          <w:p>
+            <w:pPr>
+              <w:spacing w:after="0" w:before="0" w:line="250" w:lineRule="auto"/>
+              <w:jc w:val="left"/>
+            </w:pPr>
+            <w:r>
+              <w:rPr>
+                <w:rFonts w:ascii="Arial" w:hAnsi="Arial"/>
+                <w:b w:val="0"/>
+                <w:color w:val="000000"/>
+                <w:sz w:val="19"/>
+              </w:rPr>
+              <w:t>Chip designer; already owned 6.22% before IPO</w:t>
+            </w:r>
+          </w:p>
+        </w:tc>
+      </w:tr>
+      <w:tr>
+        <w:trPr>
+          <w:cantSplit/>
+        </w:trPr>
+        <w:tc>
+          <w:tcPr>
+            <w:tcW w:type="dxa" w:w="2376"/>
+            <w:vAlign w:val="center"/>
+            <w:shd w:fill="EEF3F7"/>
+          </w:tcPr>
+          <w:p>
+            <w:pPr>
+              <w:spacing w:after="0" w:before="0" w:line="250" w:lineRule="auto"/>
+              <w:jc w:val="left"/>
+            </w:pPr>
+            <w:r>
+              <w:rPr>
+                <w:rFonts w:ascii="Arial" w:hAnsi="Arial"/>
+                <w:b w:val="0"/>
+                <w:color w:val="000000"/>
+                <w:sz w:val="19"/>
+              </w:rPr>
+              <w:t>GIC and E Fund</w:t>
+            </w:r>
+          </w:p>
+        </w:tc>
+        <w:tc>
+          <w:tcPr>
+            <w:tcW w:type="dxa" w:w="1872"/>
+            <w:vAlign w:val="center"/>
+            <w:shd w:fill="EEF3F7"/>
+          </w:tcPr>
+          <w:p>
+            <w:pPr>
+              <w:spacing w:after="0" w:before="0" w:line="250" w:lineRule="auto"/>
+              <w:jc w:val="center"/>
+            </w:pPr>
+            <w:r>
+              <w:rPr>
+                <w:rFonts w:ascii="Arial" w:hAnsi="Arial"/>
+                <w:b w:val="0"/>
+                <w:color w:val="000000"/>
+                <w:sz w:val="19"/>
+              </w:rPr>
+              <w:t>US$17m / US$16m</w:t>
+            </w:r>
+          </w:p>
+        </w:tc>
+        <w:tc>
+          <w:tcPr>
+            <w:tcW w:type="dxa" w:w="5760"/>
+            <w:vAlign w:val="center"/>
+            <w:shd w:fill="EEF3F7"/>
+          </w:tcPr>
+          <w:p>
+            <w:pPr>
+              <w:spacing w:after="0" w:before="0" w:line="250" w:lineRule="auto"/>
+              <w:jc w:val="left"/>
+            </w:pPr>
+            <w:r>
+              <w:rPr>
+                <w:rFonts w:ascii="Arial" w:hAnsi="Arial"/>
+                <w:b w:val="0"/>
+                <w:color w:val="000000"/>
+                <w:sz w:val="19"/>
+              </w:rPr>
+              <w:t>Sovereign investor / asset manager</w:t>
+            </w:r>
+          </w:p>
+        </w:tc>
+      </w:tr>
+      <w:tr>
+        <w:trPr>
+          <w:cantSplit/>
+        </w:trPr>
+        <w:tc>
+          <w:tcPr>
+            <w:tcW w:type="dxa" w:w="2376"/>
+            <w:vAlign w:val="center"/>
+            <w:shd w:fill="FFFFFF"/>
+          </w:tcPr>
+          <w:p>
+            <w:pPr>
+              <w:spacing w:after="0" w:before="0" w:line="250" w:lineRule="auto"/>
+              <w:jc w:val="left"/>
+            </w:pPr>
+            <w:r>
+              <w:rPr>
+                <w:rFonts w:ascii="Arial" w:hAnsi="Arial"/>
+                <w:b w:val="0"/>
+                <w:color w:val="000000"/>
+                <w:sz w:val="19"/>
+              </w:rPr>
+              <w:t>Millennium</w:t>
+            </w:r>
+          </w:p>
+        </w:tc>
+        <w:tc>
+          <w:tcPr>
+            <w:tcW w:type="dxa" w:w="1872"/>
+            <w:vAlign w:val="center"/>
+            <w:shd w:fill="FFFFFF"/>
+          </w:tcPr>
+          <w:p>
+            <w:pPr>
+              <w:spacing w:after="0" w:before="0" w:line="250" w:lineRule="auto"/>
+              <w:jc w:val="center"/>
+            </w:pPr>
+            <w:r>
+              <w:rPr>
+                <w:rFonts w:ascii="Arial" w:hAnsi="Arial"/>
+                <w:b w:val="0"/>
+                <w:color w:val="000000"/>
+                <w:sz w:val="19"/>
+              </w:rPr>
+              <w:t>US$15m</w:t>
+            </w:r>
+          </w:p>
+        </w:tc>
+        <w:tc>
+          <w:tcPr>
+            <w:tcW w:type="dxa" w:w="5760"/>
+            <w:vAlign w:val="center"/>
+            <w:shd w:fill="FFFFFF"/>
+          </w:tcPr>
+          <w:p>
+            <w:pPr>
+              <w:spacing w:after="0" w:before="0" w:line="250" w:lineRule="auto"/>
+              <w:jc w:val="left"/>
+            </w:pPr>
+            <w:r>
+              <w:rPr>
+                <w:rFonts w:ascii="Arial" w:hAnsi="Arial"/>
+                <w:b w:val="0"/>
+                <w:color w:val="000000"/>
+                <w:sz w:val="19"/>
+              </w:rPr>
+              <w:t>Multi-strategy investment manager</w:t>
+            </w:r>
+          </w:p>
+        </w:tc>
+      </w:tr>
+      <w:tr>
+        <w:trPr>
+          <w:cantSplit/>
+        </w:trPr>
+        <w:tc>
+          <w:tcPr>
+            <w:tcW w:type="dxa" w:w="2376"/>
+            <w:vAlign w:val="center"/>
+            <w:shd w:fill="EEF3F7"/>
+          </w:tcPr>
+          <w:p>
+            <w:pPr>
+              <w:spacing w:after="0" w:before="0" w:line="250" w:lineRule="auto"/>
+              <w:jc w:val="left"/>
+            </w:pPr>
+            <w:r>
+              <w:rPr>
+                <w:rFonts w:ascii="Arial" w:hAnsi="Arial"/>
+                <w:b w:val="0"/>
+                <w:color w:val="000000"/>
+                <w:sz w:val="19"/>
+              </w:rPr>
+              <w:t>Hosin Hong Kong</w:t>
+            </w:r>
+          </w:p>
+        </w:tc>
+        <w:tc>
+          <w:tcPr>
+            <w:tcW w:type="dxa" w:w="1872"/>
+            <w:vAlign w:val="center"/>
+            <w:shd w:fill="EEF3F7"/>
+          </w:tcPr>
+          <w:p>
+            <w:pPr>
+              <w:spacing w:after="0" w:before="0" w:line="250" w:lineRule="auto"/>
+              <w:jc w:val="center"/>
+            </w:pPr>
+            <w:r>
+              <w:rPr>
+                <w:rFonts w:ascii="Arial" w:hAnsi="Arial"/>
+                <w:b w:val="0"/>
+                <w:color w:val="000000"/>
+                <w:sz w:val="19"/>
+              </w:rPr>
+              <w:t>HK$40m</w:t>
+            </w:r>
+          </w:p>
+        </w:tc>
+        <w:tc>
+          <w:tcPr>
+            <w:tcW w:type="dxa" w:w="5760"/>
+            <w:vAlign w:val="center"/>
+            <w:shd w:fill="EEF3F7"/>
+          </w:tcPr>
+          <w:p>
+            <w:pPr>
+              <w:spacing w:after="0" w:before="0" w:line="250" w:lineRule="auto"/>
+              <w:jc w:val="left"/>
+            </w:pPr>
+            <w:r>
+              <w:rPr>
+                <w:rFonts w:ascii="Arial" w:hAnsi="Arial"/>
+                <w:b w:val="0"/>
+                <w:color w:val="000000"/>
+                <w:sz w:val="19"/>
+              </w:rPr>
+              <w:t>Memory products supplier</w:t>
+            </w:r>
+          </w:p>
+        </w:tc>
+      </w:tr>
+    </w:tbl>
+    <w:p>
+      <w:pPr>
+        <w:spacing w:after="0"/>
+      </w:pPr>
+    </w:p>
+    <w:p>
+      <w:r>
+        <w:rPr>
+          <w:sz w:val="17"/>
+        </w:rPr>
+        <w:t>Total commitments, including other anchors, are HK$1.2455bn: 33.62m H shares or 38.8% of the base issue at midpoint. This leaves 53.03m base-offer shares outside cornerstone allocation. Supplier participation does not disclose procurement discounts or guaranteed operating contracts. [1, pp.210–220]</w:t>
+      </w:r>
+    </w:p>
+    <w:p>
+      <w:r>
+        <w:rPr>
+          <w:b/>
+          <w:sz w:val="17"/>
+        </w:rPr>
+        <w:t>Proceeds and payback:</w:t>
+      </w:r>
+      <w:r>
+        <w:rPr>
+          <w:sz w:val="17"/>
+        </w:rPr>
+        <w:t xml:space="preserve"> midpoint net HK$3.12bn; R&amp;D including AI 40%, marketing 30%, internet/IoT 20%, working capital 10%. The IPO principally funds expansion rather than a memory purchase alone. Marketing and AI spending must generate enough profit to offset costs and 7.0% share dilution. [1]</w:t>
       </w:r>
     </w:p>
     <w:p>
@@ -3684,14 +3636,16 @@
     </w:p>
     <w:p>
       <w:pPr>
-        <w:pStyle w:val="Caption"/>
-        <w:spacing w:before="180"/>
+        <w:pStyle w:val="Heading1"/>
+        <w:keepNext/>
+        <w:spacing w:before="160" w:after="100"/>
       </w:pPr>
       <w:r>
         <w:rPr>
+          <w:b/>
           <w:sz w:val="23"/>
         </w:rPr>
-        <w:t>Sources | filings, analyst views and public discussion</w:t>
+        <w:t>Source references</w:t>
       </w:r>
     </w:p>
     <w:p>
@@ -3699,7 +3653,7 @@
         <w:rPr>
           <w:sz w:val="18"/>
         </w:rPr>
-        <w:t>Figures are factual checks; broker/forum statements are attributed opinions. This revision adds Anker and cornerstone supply. The accompanying research log retains detailed calculation inputs and additional forum links.</w:t>
+        <w:t>Investment arguments from analyst notes, Xueqiu and Niuniu are incorporated into the good and bad points. Company filings establish the financial figures. Forum posts express individual opinions, not a measured retail consensus.</w:t>
       </w:r>
     </w:p>
     <w:p>
@@ -3758,7 +3712,7 @@
             <w:color w:val="175F99"/>
             <w:u w:val="single"/>
           </w:rPr>
-          <w:t>Transsion H1 2026 report reproduction</w:t>
+          <w:t>Transsion H1 report pp 8 142 143 and financial statements</w:t>
         </w:r>
       </w:hyperlink>
     </w:p>
@@ -3912,164 +3866,13 @@
         </w:rPr>
         <w:t xml:space="preserve">[11] </w:t>
       </w:r>
-      <w:hyperlink r:id="rId19">
-        <w:r>
-          <w:rPr>
-            <w:color w:val="175F99"/>
-            <w:u w:val="single"/>
-          </w:rPr>
-          <w:t>Xueqiu bullish valuation post 9 May</w:t>
-        </w:r>
-      </w:hyperlink>
-    </w:p>
-    <w:p>
-      <w:pPr>
-        <w:spacing w:after="60" w:line="245" w:lineRule="auto"/>
-      </w:pPr>
       <w:r>
         <w:rPr>
           <w:sz w:val="17"/>
         </w:rPr>
-        <w:t xml:space="preserve">[12] </w:t>
+        <w:t xml:space="preserve">Price and FX inputs   </w:t>
       </w:r>
-      <w:hyperlink r:id="rId20">
-        <w:r>
-          <w:rPr>
-            <w:color w:val="175F99"/>
-            <w:u w:val="single"/>
-          </w:rPr>
-          <w:t>Xueqiu bearish earnings post 11 May</w:t>
-        </w:r>
-      </w:hyperlink>
-    </w:p>
-    <w:p>
-      <w:pPr>
-        <w:spacing w:after="60" w:line="245" w:lineRule="auto"/>
-      </w:pPr>
-      <w:r>
-        <w:rPr>
-          <w:sz w:val="17"/>
-        </w:rPr>
-        <w:t xml:space="preserve">[13] </w:t>
-      </w:r>
-      <w:hyperlink r:id="rId21">
-        <w:r>
-          <w:rPr>
-            <w:color w:val="175F99"/>
-            <w:u w:val="single"/>
-          </w:rPr>
-          <w:t>Xueqiu Q1 recovery post 28 April</w:t>
-        </w:r>
-      </w:hyperlink>
-    </w:p>
-    <w:p>
-      <w:pPr>
-        <w:spacing w:after="60" w:line="245" w:lineRule="auto"/>
-      </w:pPr>
-      <w:r>
-        <w:rPr>
-          <w:sz w:val="17"/>
-        </w:rPr>
-        <w:t xml:space="preserve">[14] </w:t>
-      </w:r>
-      <w:hyperlink r:id="rId22">
-        <w:r>
-          <w:rPr>
-            <w:color w:val="175F99"/>
-            <w:u w:val="single"/>
-          </w:rPr>
-          <w:t>Xueqiu July inventory discussion</w:t>
-        </w:r>
-      </w:hyperlink>
-    </w:p>
-    <w:p>
-      <w:pPr>
-        <w:spacing w:after="60" w:line="245" w:lineRule="auto"/>
-      </w:pPr>
-      <w:r>
-        <w:rPr>
-          <w:sz w:val="17"/>
-        </w:rPr>
-        <w:t xml:space="preserve">[15] </w:t>
-      </w:r>
-      <w:hyperlink r:id="rId23">
-        <w:r>
-          <w:rPr>
-            <w:color w:val="175F99"/>
-            <w:u w:val="single"/>
-          </w:rPr>
-          <w:t>Niuniu Bamboo Works media commentary</w:t>
-        </w:r>
-      </w:hyperlink>
-    </w:p>
-    <w:p>
-      <w:pPr>
-        <w:spacing w:after="60" w:line="245" w:lineRule="auto"/>
-      </w:pPr>
-      <w:r>
-        <w:rPr>
-          <w:sz w:val="17"/>
-        </w:rPr>
-        <w:t xml:space="preserve">[16] </w:t>
-      </w:r>
-      <w:hyperlink r:id="rId24">
-        <w:r>
-          <w:rPr>
-            <w:color w:val="175F99"/>
-            <w:u w:val="single"/>
-          </w:rPr>
-          <w:t>Xueqiu IPO Jiema media commentary</w:t>
-        </w:r>
-      </w:hyperlink>
-    </w:p>
-    <w:p>
-      <w:pPr>
-        <w:spacing w:after="60" w:line="245" w:lineRule="auto"/>
-      </w:pPr>
-      <w:r>
-        <w:rPr>
-          <w:sz w:val="17"/>
-        </w:rPr>
-        <w:t xml:space="preserve">[17] </w:t>
-      </w:r>
-      <w:hyperlink r:id="rId25">
-        <w:r>
-          <w:rPr>
-            <w:color w:val="175F99"/>
-            <w:u w:val="single"/>
-          </w:rPr>
-          <w:t>Niuniu H community public page</w:t>
-        </w:r>
-      </w:hyperlink>
-    </w:p>
-    <w:p>
-      <w:pPr>
-        <w:spacing w:after="60" w:line="245" w:lineRule="auto"/>
-      </w:pPr>
-      <w:r>
-        <w:rPr>
-          <w:sz w:val="17"/>
-        </w:rPr>
-        <w:t xml:space="preserve">[18] </w:t>
-      </w:r>
-      <w:hyperlink r:id="rId26">
-        <w:r>
-          <w:rPr>
-            <w:color w:val="175F99"/>
-            <w:u w:val="single"/>
-          </w:rPr>
-          <w:t>Niuniu A community page</w:t>
-        </w:r>
-      </w:hyperlink>
-    </w:p>
-    <w:p>
-      <w:r>
-        <w:rPr>
-          <w:sz w:val="17"/>
-        </w:rPr>
-        <w:t xml:space="preserve">[19] Price / FX inputs: </w:t>
-      </w:r>
-      <w:hyperlink r:id="rId27">
+      <w:hyperlink r:id="rId19">
         <w:r>
           <w:rPr>
             <w:color w:val="175F99"/>
@@ -4079,9 +3882,12 @@
         </w:r>
       </w:hyperlink>
       <w:r>
+        <w:rPr>
+          <w:sz w:val="17"/>
+        </w:rPr>
         <w:t xml:space="preserve"> | </w:t>
       </w:r>
-      <w:hyperlink r:id="rId28">
+      <w:hyperlink r:id="rId20">
         <w:r>
           <w:rPr>
             <w:color w:val="175F99"/>
@@ -4091,9 +3897,12 @@
         </w:r>
       </w:hyperlink>
       <w:r>
+        <w:rPr>
+          <w:sz w:val="17"/>
+        </w:rPr>
         <w:t xml:space="preserve"> | </w:t>
       </w:r>
-      <w:hyperlink r:id="rId29">
+      <w:hyperlink r:id="rId21">
         <w:r>
           <w:rPr>
             <w:color w:val="175F99"/>
@@ -4111,15 +3920,15 @@
         <w:rPr>
           <w:sz w:val="17"/>
         </w:rPr>
-        <w:t xml:space="preserve">[20] </w:t>
+        <w:t xml:space="preserve">[12] </w:t>
       </w:r>
-      <w:hyperlink r:id="rId30">
+      <w:hyperlink r:id="rId22">
         <w:r>
           <w:rPr>
             <w:color w:val="175F99"/>
             <w:u w:val="single"/>
           </w:rPr>
-          <w:t>Anker H1 report: earnings, tariff refund and fair-value gains</w:t>
+          <w:t>Anker H1 report on earnings tariff refunds and fair value</w:t>
         </w:r>
       </w:hyperlink>
     </w:p>
@@ -4131,21 +3940,155 @@
         <w:rPr>
           <w:sz w:val="17"/>
         </w:rPr>
-        <w:t xml:space="preserve">[21] </w:t>
+        <w:t xml:space="preserve">[13] </w:t>
       </w:r>
-      <w:hyperlink r:id="rId31">
+      <w:hyperlink r:id="rId23">
         <w:r>
           <w:rPr>
             <w:color w:val="175F99"/>
             <w:u w:val="single"/>
           </w:rPr>
-          <w:t>Anker A share changes, 18 September; H issuance in H1 report</w:t>
+          <w:t>Anker share changes 18 September</w:t>
         </w:r>
       </w:hyperlink>
     </w:p>
     <w:p>
       <w:pPr>
-        <w:spacing w:after="80" w:line="245" w:lineRule="auto"/>
+        <w:spacing w:after="60" w:line="245" w:lineRule="auto"/>
+      </w:pPr>
+      <w:r>
+        <w:rPr>
+          <w:sz w:val="17"/>
+        </w:rPr>
+        <w:t xml:space="preserve">[14] </w:t>
+      </w:r>
+      <w:hyperlink r:id="rId24">
+        <w:r>
+          <w:rPr>
+            <w:color w:val="175F99"/>
+            <w:u w:val="single"/>
+          </w:rPr>
+          <w:t>Niuniu 36kr Finance 28 Aug on inventory prices and category growth</w:t>
+        </w:r>
+      </w:hyperlink>
+    </w:p>
+    <w:p>
+      <w:pPr>
+        <w:spacing w:after="60" w:line="245" w:lineRule="auto"/>
+      </w:pPr>
+      <w:r>
+        <w:rPr>
+          <w:sz w:val="17"/>
+        </w:rPr>
+        <w:t xml:space="preserve">[15] </w:t>
+      </w:r>
+      <w:hyperlink r:id="rId25">
+        <w:r>
+          <w:rPr>
+            <w:color w:val="175F99"/>
+            <w:u w:val="single"/>
+          </w:rPr>
+          <w:t>TECNO CAMON 50 Pro product announcement 5 April on Ella and imaging</w:t>
+        </w:r>
+      </w:hyperlink>
+    </w:p>
+    <w:p>
+      <w:pPr>
+        <w:spacing w:after="60" w:line="245" w:lineRule="auto"/>
+      </w:pPr>
+      <w:r>
+        <w:rPr>
+          <w:sz w:val="17"/>
+        </w:rPr>
+        <w:t xml:space="preserve">[16] </w:t>
+      </w:r>
+      <w:hyperlink r:id="rId26">
+        <w:r>
+          <w:rPr>
+            <w:color w:val="175F99"/>
+            <w:u w:val="single"/>
+          </w:rPr>
+          <w:t>Issuer H1 earnings preview 20 July on pricing and inventory cost timing</w:t>
+        </w:r>
+      </w:hyperlink>
+    </w:p>
+    <w:p>
+      <w:pPr>
+        <w:spacing w:after="60" w:line="245" w:lineRule="auto"/>
+      </w:pPr>
+      <w:r>
+        <w:rPr>
+          <w:sz w:val="17"/>
+        </w:rPr>
+        <w:t xml:space="preserve">[17] </w:t>
+      </w:r>
+      <w:hyperlink r:id="rId27">
+        <w:r>
+          <w:rPr>
+            <w:color w:val="175F99"/>
+            <w:u w:val="single"/>
+          </w:rPr>
+          <w:t>Xueqiu Meigu Research 18 Aug on handset economics and AI monetisation</w:t>
+        </w:r>
+      </w:hyperlink>
+    </w:p>
+    <w:p>
+      <w:pPr>
+        <w:spacing w:after="60" w:line="245" w:lineRule="auto"/>
+      </w:pPr>
+      <w:r>
+        <w:rPr>
+          <w:sz w:val="17"/>
+        </w:rPr>
+        <w:t xml:space="preserve">[18] </w:t>
+      </w:r>
+      <w:hyperlink r:id="rId28">
+        <w:r>
+          <w:rPr>
+            <w:color w:val="175F99"/>
+            <w:u w:val="single"/>
+          </w:rPr>
+          <w:t>Transsion June application Business pp 118 121 135 on upgrades and monetisation</w:t>
+        </w:r>
+      </w:hyperlink>
+    </w:p>
+    <w:p>
+      <w:pPr>
+        <w:spacing w:after="60" w:line="245" w:lineRule="auto"/>
+      </w:pPr>
+      <w:r>
+        <w:rPr>
+          <w:sz w:val="17"/>
+        </w:rPr>
+        <w:t xml:space="preserve">[19] </w:t>
+      </w:r>
+      <w:hyperlink r:id="rId29">
+        <w:r>
+          <w:rPr>
+            <w:color w:val="175F99"/>
+            <w:u w:val="single"/>
+          </w:rPr>
+          <w:t>Xueqiu investor Chengxinge Xianren 20 Aug on inventory and H2 sustainability</w:t>
+        </w:r>
+      </w:hyperlink>
+    </w:p>
+    <w:p>
+      <w:pPr>
+        <w:pStyle w:val="Heading1"/>
+        <w:keepNext/>
+        <w:spacing w:before="160" w:after="100"/>
+      </w:pPr>
+      <w:r>
+        <w:rPr>
+          <w:b/>
+          <w:sz w:val="23"/>
+        </w:rPr>
+        <w:t>Peer filings and price histories</w:t>
+      </w:r>
+    </w:p>
+    <w:p>
+      <w:pPr>
+        <w:spacing w:after="100" w:line="245" w:lineRule="auto"/>
       </w:pPr>
       <w:r>
         <w:rPr>
@@ -4154,7 +4097,7 @@
         </w:rPr>
         <w:t xml:space="preserve">Xiaomi   </w:t>
       </w:r>
-      <w:hyperlink r:id="rId32">
+      <w:hyperlink r:id="rId30">
         <w:r>
           <w:rPr>
             <w:color w:val="175F99"/>
@@ -4164,9 +4107,12 @@
         </w:r>
       </w:hyperlink>
       <w:r>
+        <w:rPr>
+          <w:sz w:val="17"/>
+        </w:rPr>
         <w:t xml:space="preserve"> | </w:t>
       </w:r>
-      <w:hyperlink r:id="rId33">
+      <w:hyperlink r:id="rId31">
         <w:r>
           <w:rPr>
             <w:color w:val="175F99"/>
@@ -4176,9 +4122,12 @@
         </w:r>
       </w:hyperlink>
       <w:r>
+        <w:rPr>
+          <w:sz w:val="17"/>
+        </w:rPr>
         <w:t xml:space="preserve"> | </w:t>
       </w:r>
-      <w:hyperlink r:id="rId34">
+      <w:hyperlink r:id="rId32">
         <w:r>
           <w:rPr>
             <w:color w:val="175F99"/>
@@ -4190,7 +4139,7 @@
     </w:p>
     <w:p>
       <w:pPr>
-        <w:spacing w:after="80" w:line="245" w:lineRule="auto"/>
+        <w:spacing w:after="100" w:line="245" w:lineRule="auto"/>
       </w:pPr>
       <w:r>
         <w:rPr>
@@ -4199,7 +4148,7 @@
         </w:rPr>
         <w:t xml:space="preserve">Anker   </w:t>
       </w:r>
-      <w:hyperlink r:id="rId35">
+      <w:hyperlink r:id="rId33">
         <w:r>
           <w:rPr>
             <w:color w:val="175F99"/>
@@ -4209,9 +4158,12 @@
         </w:r>
       </w:hyperlink>
       <w:r>
+        <w:rPr>
+          <w:sz w:val="17"/>
+        </w:rPr>
         <w:t xml:space="preserve"> | </w:t>
       </w:r>
-      <w:hyperlink r:id="rId30">
+      <w:hyperlink r:id="rId22">
         <w:r>
           <w:rPr>
             <w:color w:val="175F99"/>
@@ -4221,9 +4173,12 @@
         </w:r>
       </w:hyperlink>
       <w:r>
+        <w:rPr>
+          <w:sz w:val="17"/>
+        </w:rPr>
         <w:t xml:space="preserve"> | </w:t>
       </w:r>
-      <w:hyperlink r:id="rId36">
+      <w:hyperlink r:id="rId34">
         <w:r>
           <w:rPr>
             <w:color w:val="175F99"/>
@@ -4233,9 +4188,12 @@
         </w:r>
       </w:hyperlink>
       <w:r>
+        <w:rPr>
+          <w:sz w:val="17"/>
+        </w:rPr>
         <w:t xml:space="preserve"> | </w:t>
       </w:r>
-      <w:hyperlink r:id="rId37">
+      <w:hyperlink r:id="rId35">
         <w:r>
           <w:rPr>
             <w:color w:val="175F99"/>
@@ -4247,7 +4205,7 @@
     </w:p>
     <w:p>
       <w:pPr>
-        <w:spacing w:after="80" w:line="245" w:lineRule="auto"/>
+        <w:spacing w:after="100" w:line="245" w:lineRule="auto"/>
       </w:pPr>
       <w:r>
         <w:rPr>
@@ -4256,7 +4214,7 @@
         </w:rPr>
         <w:t xml:space="preserve">Lenovo   </w:t>
       </w:r>
-      <w:hyperlink r:id="rId38">
+      <w:hyperlink r:id="rId36">
         <w:r>
           <w:rPr>
             <w:color w:val="175F99"/>
@@ -4266,9 +4224,12 @@
         </w:r>
       </w:hyperlink>
       <w:r>
+        <w:rPr>
+          <w:sz w:val="17"/>
+        </w:rPr>
         <w:t xml:space="preserve"> | </w:t>
       </w:r>
-      <w:hyperlink r:id="rId39">
+      <w:hyperlink r:id="rId37">
         <w:r>
           <w:rPr>
             <w:color w:val="175F99"/>
@@ -4278,9 +4239,12 @@
         </w:r>
       </w:hyperlink>
       <w:r>
+        <w:rPr>
+          <w:sz w:val="17"/>
+        </w:rPr>
         <w:t xml:space="preserve"> | </w:t>
       </w:r>
-      <w:hyperlink r:id="rId40">
+      <w:hyperlink r:id="rId38">
         <w:r>
           <w:rPr>
             <w:color w:val="175F99"/>
@@ -4290,9 +4254,12 @@
         </w:r>
       </w:hyperlink>
       <w:r>
+        <w:rPr>
+          <w:sz w:val="17"/>
+        </w:rPr>
         <w:t xml:space="preserve"> | </w:t>
       </w:r>
-      <w:hyperlink r:id="rId41">
+      <w:hyperlink r:id="rId39">
         <w:r>
           <w:rPr>
             <w:color w:val="175F99"/>
@@ -4304,7 +4271,7 @@
     </w:p>
     <w:p>
       <w:pPr>
-        <w:spacing w:after="80" w:line="245" w:lineRule="auto"/>
+        <w:spacing w:after="100" w:line="245" w:lineRule="auto"/>
       </w:pPr>
       <w:r>
         <w:rPr>
@@ -4313,7 +4280,7 @@
         </w:rPr>
         <w:t xml:space="preserve">ZTE   </w:t>
       </w:r>
-      <w:hyperlink r:id="rId42">
+      <w:hyperlink r:id="rId40">
         <w:r>
           <w:rPr>
             <w:color w:val="175F99"/>
@@ -4323,9 +4290,12 @@
         </w:r>
       </w:hyperlink>
       <w:r>
+        <w:rPr>
+          <w:sz w:val="17"/>
+        </w:rPr>
         <w:t xml:space="preserve"> | </w:t>
       </w:r>
-      <w:hyperlink r:id="rId43">
+      <w:hyperlink r:id="rId41">
         <w:r>
           <w:rPr>
             <w:color w:val="175F99"/>
@@ -4335,9 +4305,12 @@
         </w:r>
       </w:hyperlink>
       <w:r>
+        <w:rPr>
+          <w:sz w:val="17"/>
+        </w:rPr>
         <w:t xml:space="preserve"> | </w:t>
       </w:r>
-      <w:hyperlink r:id="rId44">
+      <w:hyperlink r:id="rId42">
         <w:r>
           <w:rPr>
             <w:color w:val="175F99"/>
@@ -4347,9 +4320,12 @@
         </w:r>
       </w:hyperlink>
       <w:r>
+        <w:rPr>
+          <w:sz w:val="17"/>
+        </w:rPr>
         <w:t xml:space="preserve"> | </w:t>
       </w:r>
-      <w:hyperlink r:id="rId45">
+      <w:hyperlink r:id="rId43">
         <w:r>
           <w:rPr>
             <w:color w:val="175F99"/>
@@ -4361,7 +4337,7 @@
     </w:p>
     <w:p>
       <w:pPr>
-        <w:spacing w:after="80" w:line="245" w:lineRule="auto"/>
+        <w:spacing w:after="100" w:line="245" w:lineRule="auto"/>
       </w:pPr>
       <w:r>
         <w:rPr>
@@ -4370,7 +4346,7 @@
         </w:rPr>
         <w:t xml:space="preserve">Huaqin   </w:t>
       </w:r>
-      <w:hyperlink r:id="rId46">
+      <w:hyperlink r:id="rId44">
         <w:r>
           <w:rPr>
             <w:color w:val="175F99"/>
@@ -4380,9 +4356,12 @@
         </w:r>
       </w:hyperlink>
       <w:r>
+        <w:rPr>
+          <w:sz w:val="17"/>
+        </w:rPr>
         <w:t xml:space="preserve"> | </w:t>
       </w:r>
-      <w:hyperlink r:id="rId47">
+      <w:hyperlink r:id="rId45">
         <w:r>
           <w:rPr>
             <w:color w:val="175F99"/>
@@ -4392,9 +4371,12 @@
         </w:r>
       </w:hyperlink>
       <w:r>
+        <w:rPr>
+          <w:sz w:val="17"/>
+        </w:rPr>
         <w:t xml:space="preserve"> | </w:t>
       </w:r>
-      <w:hyperlink r:id="rId48">
+      <w:hyperlink r:id="rId46">
         <w:r>
           <w:rPr>
             <w:color w:val="175F99"/>
@@ -4404,9 +4386,12 @@
         </w:r>
       </w:hyperlink>
       <w:r>
+        <w:rPr>
+          <w:sz w:val="17"/>
+        </w:rPr>
         <w:t xml:space="preserve"> | </w:t>
       </w:r>
-      <w:hyperlink r:id="rId49">
+      <w:hyperlink r:id="rId47">
         <w:r>
           <w:rPr>
             <w:color w:val="175F99"/>
@@ -4418,7 +4403,7 @@
     </w:p>
     <w:p>
       <w:pPr>
-        <w:spacing w:after="80" w:line="245" w:lineRule="auto"/>
+        <w:spacing w:after="100" w:line="245" w:lineRule="auto"/>
       </w:pPr>
       <w:r>
         <w:rPr>
@@ -4427,7 +4412,7 @@
         </w:rPr>
         <w:t xml:space="preserve">Longcheer   </w:t>
       </w:r>
-      <w:hyperlink r:id="rId50">
+      <w:hyperlink r:id="rId48">
         <w:r>
           <w:rPr>
             <w:color w:val="175F99"/>
@@ -4437,9 +4422,12 @@
         </w:r>
       </w:hyperlink>
       <w:r>
+        <w:rPr>
+          <w:sz w:val="17"/>
+        </w:rPr>
         <w:t xml:space="preserve"> | </w:t>
       </w:r>
-      <w:hyperlink r:id="rId51">
+      <w:hyperlink r:id="rId49">
         <w:r>
           <w:rPr>
             <w:color w:val="175F99"/>
@@ -4449,9 +4437,12 @@
         </w:r>
       </w:hyperlink>
       <w:r>
+        <w:rPr>
+          <w:sz w:val="17"/>
+        </w:rPr>
         <w:t xml:space="preserve"> | </w:t>
       </w:r>
-      <w:hyperlink r:id="rId52">
+      <w:hyperlink r:id="rId50">
         <w:r>
           <w:rPr>
             <w:color w:val="175F99"/>
@@ -4461,9 +4452,12 @@
         </w:r>
       </w:hyperlink>
       <w:r>
+        <w:rPr>
+          <w:sz w:val="17"/>
+        </w:rPr>
         <w:t xml:space="preserve"> | </w:t>
       </w:r>
-      <w:hyperlink r:id="rId53">
+      <w:hyperlink r:id="rId51">
         <w:r>
           <w:rPr>
             <w:color w:val="175F99"/>
@@ -4475,7 +4469,7 @@
     </w:p>
     <w:p>
       <w:pPr>
-        <w:spacing w:after="80" w:line="245" w:lineRule="auto"/>
+        <w:spacing w:after="100" w:line="245" w:lineRule="auto"/>
       </w:pPr>
       <w:r>
         <w:rPr>
@@ -4484,7 +4478,7 @@
         </w:rPr>
         <w:t xml:space="preserve">BYD Electronic   </w:t>
       </w:r>
-      <w:hyperlink r:id="rId54">
+      <w:hyperlink r:id="rId52">
         <w:r>
           <w:rPr>
             <w:color w:val="175F99"/>
@@ -4494,9 +4488,12 @@
         </w:r>
       </w:hyperlink>
       <w:r>
+        <w:rPr>
+          <w:sz w:val="17"/>
+        </w:rPr>
         <w:t xml:space="preserve"> | </w:t>
       </w:r>
-      <w:hyperlink r:id="rId55">
+      <w:hyperlink r:id="rId53">
         <w:r>
           <w:rPr>
             <w:color w:val="175F99"/>
@@ -4506,9 +4503,12 @@
         </w:r>
       </w:hyperlink>
       <w:r>
+        <w:rPr>
+          <w:sz w:val="17"/>
+        </w:rPr>
         <w:t xml:space="preserve"> | </w:t>
       </w:r>
-      <w:hyperlink r:id="rId56">
+      <w:hyperlink r:id="rId54">
         <w:r>
           <w:rPr>
             <w:color w:val="175F99"/>
@@ -4520,7 +4520,7 @@
     </w:p>
     <w:p>
       <w:pPr>
-        <w:spacing w:after="80" w:line="245" w:lineRule="auto"/>
+        <w:spacing w:after="100" w:line="245" w:lineRule="auto"/>
       </w:pPr>
       <w:r>
         <w:rPr>
@@ -4529,7 +4529,7 @@
         </w:rPr>
         <w:t xml:space="preserve">Sunny Optical   </w:t>
       </w:r>
-      <w:hyperlink r:id="rId57">
+      <w:hyperlink r:id="rId55">
         <w:r>
           <w:rPr>
             <w:color w:val="175F99"/>
@@ -4539,9 +4539,12 @@
         </w:r>
       </w:hyperlink>
       <w:r>
+        <w:rPr>
+          <w:sz w:val="17"/>
+        </w:rPr>
         <w:t xml:space="preserve"> | </w:t>
       </w:r>
-      <w:hyperlink r:id="rId58">
+      <w:hyperlink r:id="rId56">
         <w:r>
           <w:rPr>
             <w:color w:val="175F99"/>
@@ -4551,9 +4554,12 @@
         </w:r>
       </w:hyperlink>
       <w:r>
+        <w:rPr>
+          <w:sz w:val="17"/>
+        </w:rPr>
         <w:t xml:space="preserve"> | </w:t>
       </w:r>
-      <w:hyperlink r:id="rId59">
+      <w:hyperlink r:id="rId57">
         <w:r>
           <w:rPr>
             <w:color w:val="175F99"/>
@@ -4564,7 +4570,7 @@
       </w:hyperlink>
     </w:p>
     <w:sectPr>
-      <w:footerReference w:type="default" r:id="rId60"/>
+      <w:footerReference w:type="default" r:id="rId58"/>
       <w:pgSz w:w="11905" w:h="16838"/>
       <w:pgMar w:top="893" w:right="936" w:bottom="893" w:left="936" w:header="720" w:footer="403" w:gutter="0"/>
       <w:cols w:space="720"/>
@@ -5315,7 +5321,7 @@
       <w:color w:val="000000"/>
       <w:spacing w:val="5"/>
       <w:kern w:val="28"/>
-      <w:sz w:val="44"/>
+      <w:sz w:val="42"/>
       <w:szCs w:val="52"/>
     </w:rPr>
   </w:style>

</xml_diff>